<commit_message>
replaced doc with new version
</commit_message>
<xml_diff>
--- a/prog1/Memory Simuilation.docx
+++ b/prog1/Memory Simuilation.docx
@@ -104,7 +104,25 @@
           <w:sz w:val="22"/>
           <w:szCs w:val="22"/>
         </w:rPr>
-        <w:t>Using c++, implement a simulator</w:t>
+        <w:t xml:space="preserve">Using </w:t>
+      </w:r>
+      <w:proofErr w:type="spellStart"/>
+      <w:r>
+        <w:rPr>
+          <w:rFonts w:ascii="Times New Roman" w:hAnsi="Times New Roman" w:cs="Times New Roman"/>
+          <w:sz w:val="22"/>
+          <w:szCs w:val="22"/>
+        </w:rPr>
+        <w:t>c++</w:t>
+      </w:r>
+      <w:proofErr w:type="spellEnd"/>
+      <w:r>
+        <w:rPr>
+          <w:rFonts w:ascii="Times New Roman" w:hAnsi="Times New Roman" w:cs="Times New Roman"/>
+          <w:sz w:val="22"/>
+          <w:szCs w:val="22"/>
+        </w:rPr>
+        <w:t>, implement a simulator</w:t>
       </w:r>
       <w:r>
         <w:rPr>
@@ -259,7 +277,25 @@
           <w:sz w:val="22"/>
           <w:szCs w:val="22"/>
         </w:rPr>
-        <w:t>A doubly-linked list will be used to track the</w:t>
+        <w:t xml:space="preserve">A </w:t>
+      </w:r>
+      <w:proofErr w:type="gramStart"/>
+      <w:r>
+        <w:rPr>
+          <w:rFonts w:ascii="Times New Roman" w:hAnsi="Times New Roman" w:cs="Times New Roman"/>
+          <w:sz w:val="22"/>
+          <w:szCs w:val="22"/>
+        </w:rPr>
+        <w:t>doubly-linked</w:t>
+      </w:r>
+      <w:proofErr w:type="gramEnd"/>
+      <w:r>
+        <w:rPr>
+          <w:rFonts w:ascii="Times New Roman" w:hAnsi="Times New Roman" w:cs="Times New Roman"/>
+          <w:sz w:val="22"/>
+          <w:szCs w:val="22"/>
+        </w:rPr>
+        <w:t xml:space="preserve"> list will be used to track the</w:t>
       </w:r>
       <w:r>
         <w:rPr>
@@ -542,15 +578,7 @@
           <w:sz w:val="22"/>
           <w:szCs w:val="22"/>
         </w:rPr>
-        <w:t>node</w:t>
-      </w:r>
-      <w:r>
-        <w:rPr>
-          <w:rFonts w:ascii="Times New Roman" w:hAnsi="Times New Roman" w:cs="Times New Roman"/>
-          <w:sz w:val="22"/>
-          <w:szCs w:val="22"/>
-        </w:rPr>
-        <w:t>:</w:t>
+        <w:t>node:</w:t>
       </w:r>
     </w:p>
     <w:p>
@@ -594,7 +622,25 @@
           <w:sz w:val="22"/>
           <w:szCs w:val="22"/>
         </w:rPr>
-        <w:t xml:space="preserve">int pid; -1 indicates a free node; &gt;= 0 indicates a node allocated to </w:t>
+        <w:t xml:space="preserve">int </w:t>
+      </w:r>
+      <w:proofErr w:type="spellStart"/>
+      <w:r>
+        <w:rPr>
+          <w:rFonts w:ascii="Times New Roman" w:hAnsi="Times New Roman" w:cs="Times New Roman"/>
+          <w:sz w:val="22"/>
+          <w:szCs w:val="22"/>
+        </w:rPr>
+        <w:t>pid</w:t>
+      </w:r>
+      <w:proofErr w:type="spellEnd"/>
+      <w:r>
+        <w:rPr>
+          <w:rFonts w:ascii="Times New Roman" w:hAnsi="Times New Roman" w:cs="Times New Roman"/>
+          <w:sz w:val="22"/>
+          <w:szCs w:val="22"/>
+        </w:rPr>
+        <w:t xml:space="preserve">; -1 indicates a free node; &gt;= 0 indicates a node allocated to </w:t>
       </w:r>
       <w:r>
         <w:rPr>
@@ -654,7 +700,43 @@
           <w:sz w:val="22"/>
           <w:szCs w:val="22"/>
         </w:rPr>
-        <w:t>node *prev, *next; linkage pointers. The first node shall have NULL for its prev, the last node shall have NULL for its next.</w:t>
+        <w:t>node *</w:t>
+      </w:r>
+      <w:proofErr w:type="spellStart"/>
+      <w:r>
+        <w:rPr>
+          <w:rFonts w:ascii="Times New Roman" w:hAnsi="Times New Roman" w:cs="Times New Roman"/>
+          <w:sz w:val="22"/>
+          <w:szCs w:val="22"/>
+        </w:rPr>
+        <w:t>prev</w:t>
+      </w:r>
+      <w:proofErr w:type="spellEnd"/>
+      <w:r>
+        <w:rPr>
+          <w:rFonts w:ascii="Times New Roman" w:hAnsi="Times New Roman" w:cs="Times New Roman"/>
+          <w:sz w:val="22"/>
+          <w:szCs w:val="22"/>
+        </w:rPr>
+        <w:t xml:space="preserve">, *next; linkage pointers. The first node shall have NULL for its </w:t>
+      </w:r>
+      <w:proofErr w:type="spellStart"/>
+      <w:r>
+        <w:rPr>
+          <w:rFonts w:ascii="Times New Roman" w:hAnsi="Times New Roman" w:cs="Times New Roman"/>
+          <w:sz w:val="22"/>
+          <w:szCs w:val="22"/>
+        </w:rPr>
+        <w:t>prev</w:t>
+      </w:r>
+      <w:proofErr w:type="spellEnd"/>
+      <w:r>
+        <w:rPr>
+          <w:rFonts w:ascii="Times New Roman" w:hAnsi="Times New Roman" w:cs="Times New Roman"/>
+          <w:sz w:val="22"/>
+          <w:szCs w:val="22"/>
+        </w:rPr>
+        <w:t>, the last node shall have NULL for its next.</w:t>
       </w:r>
     </w:p>
     <w:p>
@@ -676,7 +758,25 @@
           <w:sz w:val="22"/>
           <w:szCs w:val="22"/>
         </w:rPr>
-        <w:t>Public member functions:</w:t>
+        <w:t xml:space="preserve">Public </w:t>
+      </w:r>
+      <w:proofErr w:type="gramStart"/>
+      <w:r>
+        <w:rPr>
+          <w:rFonts w:ascii="Times New Roman" w:hAnsi="Times New Roman" w:cs="Times New Roman"/>
+          <w:sz w:val="22"/>
+          <w:szCs w:val="22"/>
+        </w:rPr>
+        <w:t>member functions</w:t>
+      </w:r>
+      <w:proofErr w:type="gramEnd"/>
+      <w:r>
+        <w:rPr>
+          <w:rFonts w:ascii="Times New Roman" w:hAnsi="Times New Roman" w:cs="Times New Roman"/>
+          <w:sz w:val="22"/>
+          <w:szCs w:val="22"/>
+        </w:rPr>
+        <w:t>:</w:t>
       </w:r>
     </w:p>
     <w:p>
@@ -692,13 +792,41 @@
           <w:szCs w:val="22"/>
         </w:rPr>
       </w:pPr>
-      <w:r>
-        <w:rPr>
-          <w:rFonts w:ascii="Times New Roman" w:hAnsi="Times New Roman" w:cs="Times New Roman"/>
-          <w:sz w:val="22"/>
-          <w:szCs w:val="22"/>
-        </w:rPr>
-        <w:t>node(int pid, unsigned int start, unsigned int length,</w:t>
+      <w:proofErr w:type="gramStart"/>
+      <w:r>
+        <w:rPr>
+          <w:rFonts w:ascii="Times New Roman" w:hAnsi="Times New Roman" w:cs="Times New Roman"/>
+          <w:sz w:val="22"/>
+          <w:szCs w:val="22"/>
+        </w:rPr>
+        <w:t>node(</w:t>
+      </w:r>
+      <w:proofErr w:type="gramEnd"/>
+      <w:r>
+        <w:rPr>
+          <w:rFonts w:ascii="Times New Roman" w:hAnsi="Times New Roman" w:cs="Times New Roman"/>
+          <w:sz w:val="22"/>
+          <w:szCs w:val="22"/>
+        </w:rPr>
+        <w:t xml:space="preserve">int </w:t>
+      </w:r>
+      <w:proofErr w:type="spellStart"/>
+      <w:r>
+        <w:rPr>
+          <w:rFonts w:ascii="Times New Roman" w:hAnsi="Times New Roman" w:cs="Times New Roman"/>
+          <w:sz w:val="22"/>
+          <w:szCs w:val="22"/>
+        </w:rPr>
+        <w:t>pid</w:t>
+      </w:r>
+      <w:proofErr w:type="spellEnd"/>
+      <w:r>
+        <w:rPr>
+          <w:rFonts w:ascii="Times New Roman" w:hAnsi="Times New Roman" w:cs="Times New Roman"/>
+          <w:sz w:val="22"/>
+          <w:szCs w:val="22"/>
+        </w:rPr>
+        <w:t>, unsigned int start, unsigned int length,</w:t>
       </w:r>
     </w:p>
     <w:p>
@@ -717,7 +845,25 @@
           <w:sz w:val="22"/>
           <w:szCs w:val="22"/>
         </w:rPr>
-        <w:t xml:space="preserve">       node *prev = NULL, node *next = NULL); the node constructor</w:t>
+        <w:t xml:space="preserve">       node *</w:t>
+      </w:r>
+      <w:proofErr w:type="spellStart"/>
+      <w:r>
+        <w:rPr>
+          <w:rFonts w:ascii="Times New Roman" w:hAnsi="Times New Roman" w:cs="Times New Roman"/>
+          <w:sz w:val="22"/>
+          <w:szCs w:val="22"/>
+        </w:rPr>
+        <w:t>prev</w:t>
+      </w:r>
+      <w:proofErr w:type="spellEnd"/>
+      <w:r>
+        <w:rPr>
+          <w:rFonts w:ascii="Times New Roman" w:hAnsi="Times New Roman" w:cs="Times New Roman"/>
+          <w:sz w:val="22"/>
+          <w:szCs w:val="22"/>
+        </w:rPr>
+        <w:t xml:space="preserve"> = NULL, node *next = NULL); the node constructor</w:t>
       </w:r>
     </w:p>
     <w:p>
@@ -739,7 +885,25 @@
           <w:sz w:val="22"/>
           <w:szCs w:val="22"/>
         </w:rPr>
-        <w:t>Friends the memManager class.</w:t>
+        <w:t xml:space="preserve">Friends the </w:t>
+      </w:r>
+      <w:proofErr w:type="spellStart"/>
+      <w:r>
+        <w:rPr>
+          <w:rFonts w:ascii="Times New Roman" w:hAnsi="Times New Roman" w:cs="Times New Roman"/>
+          <w:sz w:val="22"/>
+          <w:szCs w:val="22"/>
+        </w:rPr>
+        <w:t>memManager</w:t>
+      </w:r>
+      <w:proofErr w:type="spellEnd"/>
+      <w:r>
+        <w:rPr>
+          <w:rFonts w:ascii="Times New Roman" w:hAnsi="Times New Roman" w:cs="Times New Roman"/>
+          <w:sz w:val="22"/>
+          <w:szCs w:val="22"/>
+        </w:rPr>
+        <w:t xml:space="preserve"> class.</w:t>
       </w:r>
     </w:p>
     <w:p>
@@ -755,13 +919,23 @@
           <w:szCs w:val="22"/>
         </w:rPr>
       </w:pPr>
-      <w:r>
-        <w:rPr>
-          <w:rFonts w:ascii="Times New Roman" w:hAnsi="Times New Roman" w:cs="Times New Roman"/>
-          <w:sz w:val="22"/>
-          <w:szCs w:val="22"/>
-        </w:rPr>
-        <w:t>memManager:</w:t>
+      <w:proofErr w:type="spellStart"/>
+      <w:r>
+        <w:rPr>
+          <w:rFonts w:ascii="Times New Roman" w:hAnsi="Times New Roman" w:cs="Times New Roman"/>
+          <w:sz w:val="22"/>
+          <w:szCs w:val="22"/>
+        </w:rPr>
+        <w:t>memManager</w:t>
+      </w:r>
+      <w:proofErr w:type="spellEnd"/>
+      <w:r>
+        <w:rPr>
+          <w:rFonts w:ascii="Times New Roman" w:hAnsi="Times New Roman" w:cs="Times New Roman"/>
+          <w:sz w:val="22"/>
+          <w:szCs w:val="22"/>
+        </w:rPr>
+        <w:t>:</w:t>
       </w:r>
     </w:p>
     <w:p>
@@ -805,7 +979,25 @@
           <w:sz w:val="22"/>
           <w:szCs w:val="22"/>
         </w:rPr>
-        <w:t>node *memRoot; pointer to the first node of the doubly linked list, for use in all policies.</w:t>
+        <w:t>node *</w:t>
+      </w:r>
+      <w:proofErr w:type="spellStart"/>
+      <w:r>
+        <w:rPr>
+          <w:rFonts w:ascii="Times New Roman" w:hAnsi="Times New Roman" w:cs="Times New Roman"/>
+          <w:sz w:val="22"/>
+          <w:szCs w:val="22"/>
+        </w:rPr>
+        <w:t>memRoot</w:t>
+      </w:r>
+      <w:proofErr w:type="spellEnd"/>
+      <w:r>
+        <w:rPr>
+          <w:rFonts w:ascii="Times New Roman" w:hAnsi="Times New Roman" w:cs="Times New Roman"/>
+          <w:sz w:val="22"/>
+          <w:szCs w:val="22"/>
+        </w:rPr>
+        <w:t>; pointer to the first node of the doubly linked list, for use in all policies.</w:t>
       </w:r>
     </w:p>
     <w:p>
@@ -827,39 +1019,49 @@
           <w:sz w:val="22"/>
           <w:szCs w:val="22"/>
         </w:rPr>
-        <w:t>node *memNext; pointer to the next</w:t>
-      </w:r>
-      <w:r>
-        <w:rPr>
-          <w:rFonts w:ascii="Times New Roman" w:hAnsi="Times New Roman" w:cs="Times New Roman"/>
-          <w:sz w:val="22"/>
-          <w:szCs w:val="22"/>
-        </w:rPr>
-        <w:t xml:space="preserve"> node in the doubly linked list</w:t>
-      </w:r>
-      <w:r>
-        <w:rPr>
-          <w:rFonts w:ascii="Times New Roman" w:hAnsi="Times New Roman" w:cs="Times New Roman"/>
-          <w:sz w:val="22"/>
-          <w:szCs w:val="22"/>
-        </w:rPr>
-        <w:t xml:space="preserve"> from which to start the next search for a free memory segment</w:t>
-      </w:r>
-      <w:r>
-        <w:rPr>
-          <w:rFonts w:ascii="Times New Roman" w:hAnsi="Times New Roman" w:cs="Times New Roman"/>
-          <w:sz w:val="22"/>
-          <w:szCs w:val="22"/>
-        </w:rPr>
-        <w:t xml:space="preserve">, supporting </w:t>
-      </w:r>
-      <w:r>
-        <w:rPr>
-          <w:rFonts w:ascii="Times New Roman" w:hAnsi="Times New Roman" w:cs="Times New Roman"/>
-          <w:sz w:val="22"/>
-          <w:szCs w:val="22"/>
-        </w:rPr>
-        <w:t>the next fit policy.</w:t>
+        <w:t xml:space="preserve">unsigned int </w:t>
+      </w:r>
+      <w:proofErr w:type="spellStart"/>
+      <w:r>
+        <w:rPr>
+          <w:rFonts w:ascii="Times New Roman" w:hAnsi="Times New Roman" w:cs="Times New Roman"/>
+          <w:sz w:val="22"/>
+          <w:szCs w:val="22"/>
+        </w:rPr>
+        <w:t>n</w:t>
+      </w:r>
+      <w:r>
+        <w:rPr>
+          <w:rFonts w:ascii="Times New Roman" w:hAnsi="Times New Roman" w:cs="Times New Roman"/>
+          <w:sz w:val="22"/>
+          <w:szCs w:val="22"/>
+        </w:rPr>
+        <w:t>ode</w:t>
+      </w:r>
+      <w:r>
+        <w:rPr>
+          <w:rFonts w:ascii="Times New Roman" w:hAnsi="Times New Roman" w:cs="Times New Roman"/>
+          <w:sz w:val="22"/>
+          <w:szCs w:val="22"/>
+        </w:rPr>
+        <w:t>Count</w:t>
+      </w:r>
+      <w:proofErr w:type="spellEnd"/>
+      <w:r>
+        <w:rPr>
+          <w:rFonts w:ascii="Times New Roman" w:hAnsi="Times New Roman" w:cs="Times New Roman"/>
+          <w:sz w:val="22"/>
+          <w:szCs w:val="22"/>
+        </w:rPr>
+        <w:t xml:space="preserve"> - </w:t>
+      </w:r>
+      <w:r>
+        <w:rPr>
+          <w:rFonts w:ascii="Times New Roman" w:hAnsi="Times New Roman" w:cs="Times New Roman"/>
+          <w:sz w:val="22"/>
+          <w:szCs w:val="22"/>
+        </w:rPr>
+        <w:t>Node count of the number of nodes</w:t>
       </w:r>
     </w:p>
     <w:p>
@@ -881,7 +1083,47 @@
           <w:sz w:val="22"/>
           <w:szCs w:val="22"/>
         </w:rPr>
-        <w:t>unsigned int start, length; the starting index of memory block and the number of memory blocks represented by this node in the list.</w:t>
+        <w:t>unsigned int policy; 1-4 for the policies listed above, in order.</w:t>
+      </w:r>
+    </w:p>
+    <w:p>
+      <w:pPr>
+        <w:pStyle w:val="ListParagraph"/>
+        <w:numPr>
+          <w:ilvl w:val="1"/>
+          <w:numId w:val="2"/>
+        </w:numPr>
+        <w:rPr>
+          <w:rFonts w:ascii="Times New Roman" w:hAnsi="Times New Roman" w:cs="Times New Roman"/>
+          <w:sz w:val="22"/>
+          <w:szCs w:val="22"/>
+        </w:rPr>
+      </w:pPr>
+      <w:r>
+        <w:rPr>
+          <w:rFonts w:ascii="Times New Roman" w:hAnsi="Times New Roman" w:cs="Times New Roman"/>
+          <w:sz w:val="22"/>
+          <w:szCs w:val="22"/>
+        </w:rPr>
+        <w:t xml:space="preserve">Public </w:t>
+      </w:r>
+      <w:proofErr w:type="gramStart"/>
+      <w:r>
+        <w:rPr>
+          <w:rFonts w:ascii="Times New Roman" w:hAnsi="Times New Roman" w:cs="Times New Roman"/>
+          <w:sz w:val="22"/>
+          <w:szCs w:val="22"/>
+        </w:rPr>
+        <w:t>member functions</w:t>
+      </w:r>
+      <w:proofErr w:type="gramEnd"/>
+      <w:r>
+        <w:rPr>
+          <w:rFonts w:ascii="Times New Roman" w:hAnsi="Times New Roman" w:cs="Times New Roman"/>
+          <w:sz w:val="22"/>
+          <w:szCs w:val="22"/>
+        </w:rPr>
+        <w:t>:</w:t>
       </w:r>
     </w:p>
     <w:p>
@@ -897,13 +1139,650 @@
           <w:szCs w:val="22"/>
         </w:rPr>
       </w:pPr>
-      <w:r>
-        <w:rPr>
-          <w:rFonts w:ascii="Times New Roman" w:hAnsi="Times New Roman" w:cs="Times New Roman"/>
-          <w:sz w:val="22"/>
-          <w:szCs w:val="22"/>
-        </w:rPr>
-        <w:t>unsigned int policy; 1-4 for the policies listed above, in order.</w:t>
+      <w:proofErr w:type="spellStart"/>
+      <w:proofErr w:type="gramStart"/>
+      <w:r>
+        <w:rPr>
+          <w:rFonts w:ascii="Times New Roman" w:hAnsi="Times New Roman" w:cs="Times New Roman"/>
+          <w:sz w:val="22"/>
+          <w:szCs w:val="22"/>
+        </w:rPr>
+        <w:t>memManager</w:t>
+      </w:r>
+      <w:proofErr w:type="spellEnd"/>
+      <w:r>
+        <w:rPr>
+          <w:rFonts w:ascii="Times New Roman" w:hAnsi="Times New Roman" w:cs="Times New Roman"/>
+          <w:sz w:val="22"/>
+          <w:szCs w:val="22"/>
+        </w:rPr>
+        <w:t>(</w:t>
+      </w:r>
+      <w:proofErr w:type="gramEnd"/>
+      <w:r>
+        <w:rPr>
+          <w:rFonts w:ascii="Times New Roman" w:hAnsi="Times New Roman" w:cs="Times New Roman"/>
+          <w:sz w:val="22"/>
+          <w:szCs w:val="22"/>
+        </w:rPr>
+        <w:t xml:space="preserve">unsigned int policy, unsigned int </w:t>
+      </w:r>
+      <w:proofErr w:type="spellStart"/>
+      <w:r>
+        <w:rPr>
+          <w:rFonts w:ascii="Times New Roman" w:hAnsi="Times New Roman" w:cs="Times New Roman"/>
+          <w:sz w:val="22"/>
+          <w:szCs w:val="22"/>
+        </w:rPr>
+        <w:t>blockCount</w:t>
+      </w:r>
+      <w:proofErr w:type="spellEnd"/>
+      <w:r>
+        <w:rPr>
+          <w:rFonts w:ascii="Times New Roman" w:hAnsi="Times New Roman" w:cs="Times New Roman"/>
+          <w:sz w:val="22"/>
+          <w:szCs w:val="22"/>
+        </w:rPr>
+        <w:t>; constructor that builds an object that will use the given policy for a memory of the given number of blocks</w:t>
+      </w:r>
+      <w:r>
+        <w:rPr>
+          <w:rFonts w:ascii="Times New Roman" w:hAnsi="Times New Roman" w:cs="Times New Roman"/>
+          <w:sz w:val="22"/>
+          <w:szCs w:val="22"/>
+        </w:rPr>
+        <w:t>, 128 in the final submission.</w:t>
+      </w:r>
+    </w:p>
+    <w:p>
+      <w:pPr>
+        <w:pStyle w:val="ListParagraph"/>
+        <w:numPr>
+          <w:ilvl w:val="2"/>
+          <w:numId w:val="2"/>
+        </w:numPr>
+        <w:rPr>
+          <w:rFonts w:ascii="Times New Roman" w:hAnsi="Times New Roman" w:cs="Times New Roman"/>
+          <w:sz w:val="22"/>
+          <w:szCs w:val="22"/>
+        </w:rPr>
+      </w:pPr>
+      <w:r>
+        <w:rPr>
+          <w:rFonts w:ascii="Times New Roman" w:hAnsi="Times New Roman" w:cs="Times New Roman"/>
+          <w:sz w:val="22"/>
+          <w:szCs w:val="22"/>
+        </w:rPr>
+        <w:t>~</w:t>
+      </w:r>
+      <w:proofErr w:type="spellStart"/>
+      <w:proofErr w:type="gramStart"/>
+      <w:r>
+        <w:rPr>
+          <w:rFonts w:ascii="Times New Roman" w:hAnsi="Times New Roman" w:cs="Times New Roman"/>
+          <w:sz w:val="22"/>
+          <w:szCs w:val="22"/>
+        </w:rPr>
+        <w:t>memManager</w:t>
+      </w:r>
+      <w:proofErr w:type="spellEnd"/>
+      <w:r>
+        <w:rPr>
+          <w:rFonts w:ascii="Times New Roman" w:hAnsi="Times New Roman" w:cs="Times New Roman"/>
+          <w:sz w:val="22"/>
+          <w:szCs w:val="22"/>
+        </w:rPr>
+        <w:t>(</w:t>
+      </w:r>
+      <w:proofErr w:type="gramEnd"/>
+      <w:r>
+        <w:rPr>
+          <w:rFonts w:ascii="Times New Roman" w:hAnsi="Times New Roman" w:cs="Times New Roman"/>
+          <w:sz w:val="22"/>
+          <w:szCs w:val="22"/>
+        </w:rPr>
+        <w:t>); the destructor</w:t>
+      </w:r>
+    </w:p>
+    <w:p>
+      <w:pPr>
+        <w:pStyle w:val="ListParagraph"/>
+        <w:numPr>
+          <w:ilvl w:val="2"/>
+          <w:numId w:val="2"/>
+        </w:numPr>
+        <w:rPr>
+          <w:rFonts w:ascii="Times New Roman" w:hAnsi="Times New Roman" w:cs="Times New Roman"/>
+          <w:sz w:val="22"/>
+          <w:szCs w:val="22"/>
+        </w:rPr>
+      </w:pPr>
+      <w:r>
+        <w:rPr>
+          <w:rFonts w:ascii="Times New Roman" w:hAnsi="Times New Roman" w:cs="Times New Roman"/>
+          <w:sz w:val="22"/>
+          <w:szCs w:val="22"/>
+        </w:rPr>
+        <w:lastRenderedPageBreak/>
+        <w:t xml:space="preserve">int </w:t>
+      </w:r>
+      <w:proofErr w:type="spellStart"/>
+      <w:r>
+        <w:rPr>
+          <w:rFonts w:ascii="Times New Roman" w:hAnsi="Times New Roman" w:cs="Times New Roman"/>
+          <w:sz w:val="22"/>
+          <w:szCs w:val="22"/>
+        </w:rPr>
+        <w:t>allocMem</w:t>
+      </w:r>
+      <w:proofErr w:type="spellEnd"/>
+      <w:r>
+        <w:rPr>
+          <w:rFonts w:ascii="Times New Roman" w:hAnsi="Times New Roman" w:cs="Times New Roman"/>
+          <w:sz w:val="22"/>
+          <w:szCs w:val="22"/>
+        </w:rPr>
+        <w:t xml:space="preserve"> (int </w:t>
+      </w:r>
+      <w:proofErr w:type="spellStart"/>
+      <w:r>
+        <w:rPr>
+          <w:rFonts w:ascii="Times New Roman" w:hAnsi="Times New Roman" w:cs="Times New Roman"/>
+          <w:sz w:val="22"/>
+          <w:szCs w:val="22"/>
+        </w:rPr>
+        <w:t>process_id</w:t>
+      </w:r>
+      <w:proofErr w:type="spellEnd"/>
+      <w:r>
+        <w:rPr>
+          <w:rFonts w:ascii="Times New Roman" w:hAnsi="Times New Roman" w:cs="Times New Roman"/>
+          <w:sz w:val="22"/>
+          <w:szCs w:val="22"/>
+        </w:rPr>
+        <w:t xml:space="preserve">, int </w:t>
+      </w:r>
+      <w:proofErr w:type="spellStart"/>
+      <w:r>
+        <w:rPr>
+          <w:rFonts w:ascii="Times New Roman" w:hAnsi="Times New Roman" w:cs="Times New Roman"/>
+          <w:sz w:val="22"/>
+          <w:szCs w:val="22"/>
+        </w:rPr>
+        <w:t>num_units</w:t>
+      </w:r>
+      <w:proofErr w:type="spellEnd"/>
+      <w:r>
+        <w:rPr>
+          <w:rFonts w:ascii="Times New Roman" w:hAnsi="Times New Roman" w:cs="Times New Roman"/>
+          <w:sz w:val="22"/>
+          <w:szCs w:val="22"/>
+        </w:rPr>
+        <w:t xml:space="preserve">): allocates </w:t>
+      </w:r>
+      <w:proofErr w:type="spellStart"/>
+      <w:r>
+        <w:rPr>
+          <w:rFonts w:ascii="Times New Roman" w:hAnsi="Times New Roman" w:cs="Times New Roman"/>
+          <w:sz w:val="22"/>
+          <w:szCs w:val="22"/>
+        </w:rPr>
+        <w:t>num_</w:t>
+      </w:r>
+      <w:proofErr w:type="gramStart"/>
+      <w:r>
+        <w:rPr>
+          <w:rFonts w:ascii="Times New Roman" w:hAnsi="Times New Roman" w:cs="Times New Roman"/>
+          <w:sz w:val="22"/>
+          <w:szCs w:val="22"/>
+        </w:rPr>
+        <w:t>units</w:t>
+      </w:r>
+      <w:proofErr w:type="spellEnd"/>
+      <w:proofErr w:type="gramEnd"/>
+      <w:r>
+        <w:rPr>
+          <w:rFonts w:ascii="Times New Roman" w:hAnsi="Times New Roman" w:cs="Times New Roman"/>
+          <w:sz w:val="22"/>
+          <w:szCs w:val="22"/>
+        </w:rPr>
+        <w:t xml:space="preserve"> units of memory to a process whose id is </w:t>
+      </w:r>
+      <w:proofErr w:type="spellStart"/>
+      <w:r>
+        <w:rPr>
+          <w:rFonts w:ascii="Times New Roman" w:hAnsi="Times New Roman" w:cs="Times New Roman"/>
+          <w:sz w:val="22"/>
+          <w:szCs w:val="22"/>
+        </w:rPr>
+        <w:t>process_id</w:t>
+      </w:r>
+      <w:proofErr w:type="spellEnd"/>
+      <w:r>
+        <w:rPr>
+          <w:rFonts w:ascii="Times New Roman" w:hAnsi="Times New Roman" w:cs="Times New Roman"/>
+          <w:sz w:val="22"/>
+          <w:szCs w:val="22"/>
+        </w:rPr>
+        <w:t>. If successful, it returns the number of nodes traversed in the linked list. Otherwise, it returns -1.</w:t>
+      </w:r>
+    </w:p>
+    <w:p>
+      <w:pPr>
+        <w:pStyle w:val="ListParagraph"/>
+        <w:numPr>
+          <w:ilvl w:val="2"/>
+          <w:numId w:val="2"/>
+        </w:numPr>
+        <w:rPr>
+          <w:rFonts w:ascii="Times New Roman" w:hAnsi="Times New Roman" w:cs="Times New Roman"/>
+          <w:sz w:val="22"/>
+          <w:szCs w:val="22"/>
+        </w:rPr>
+      </w:pPr>
+      <w:r>
+        <w:rPr>
+          <w:rFonts w:ascii="Times New Roman" w:hAnsi="Times New Roman" w:cs="Times New Roman"/>
+          <w:sz w:val="22"/>
+          <w:szCs w:val="22"/>
+        </w:rPr>
+        <w:t>void</w:t>
+      </w:r>
+      <w:r>
+        <w:rPr>
+          <w:rFonts w:ascii="Times New Roman" w:hAnsi="Times New Roman" w:cs="Times New Roman"/>
+          <w:sz w:val="22"/>
+          <w:szCs w:val="22"/>
+        </w:rPr>
+        <w:t xml:space="preserve"> </w:t>
+      </w:r>
+      <w:proofErr w:type="spellStart"/>
+      <w:r>
+        <w:rPr>
+          <w:rFonts w:ascii="Times New Roman" w:hAnsi="Times New Roman" w:cs="Times New Roman"/>
+          <w:sz w:val="22"/>
+          <w:szCs w:val="22"/>
+        </w:rPr>
+        <w:t>deallocMem</w:t>
+      </w:r>
+      <w:proofErr w:type="spellEnd"/>
+      <w:r>
+        <w:rPr>
+          <w:rFonts w:ascii="Times New Roman" w:hAnsi="Times New Roman" w:cs="Times New Roman"/>
+          <w:sz w:val="22"/>
+          <w:szCs w:val="22"/>
+        </w:rPr>
+        <w:t xml:space="preserve"> (int </w:t>
+      </w:r>
+      <w:proofErr w:type="spellStart"/>
+      <w:r>
+        <w:rPr>
+          <w:rFonts w:ascii="Times New Roman" w:hAnsi="Times New Roman" w:cs="Times New Roman"/>
+          <w:sz w:val="22"/>
+          <w:szCs w:val="22"/>
+        </w:rPr>
+        <w:t>process_id</w:t>
+      </w:r>
+      <w:proofErr w:type="spellEnd"/>
+      <w:r>
+        <w:rPr>
+          <w:rFonts w:ascii="Times New Roman" w:hAnsi="Times New Roman" w:cs="Times New Roman"/>
+          <w:sz w:val="22"/>
+          <w:szCs w:val="22"/>
+        </w:rPr>
+        <w:t xml:space="preserve">): deallocates the memory allocated to the process whose id is </w:t>
+      </w:r>
+      <w:proofErr w:type="spellStart"/>
+      <w:r>
+        <w:rPr>
+          <w:rFonts w:ascii="Times New Roman" w:hAnsi="Times New Roman" w:cs="Times New Roman"/>
+          <w:sz w:val="22"/>
+          <w:szCs w:val="22"/>
+        </w:rPr>
+        <w:t>process_id</w:t>
+      </w:r>
+      <w:proofErr w:type="spellEnd"/>
+      <w:r>
+        <w:rPr>
+          <w:rFonts w:ascii="Times New Roman" w:hAnsi="Times New Roman" w:cs="Times New Roman"/>
+          <w:sz w:val="22"/>
+          <w:szCs w:val="22"/>
+        </w:rPr>
+        <w:t xml:space="preserve">, if that </w:t>
+      </w:r>
+      <w:proofErr w:type="spellStart"/>
+      <w:r>
+        <w:rPr>
+          <w:rFonts w:ascii="Times New Roman" w:hAnsi="Times New Roman" w:cs="Times New Roman"/>
+          <w:sz w:val="22"/>
+          <w:szCs w:val="22"/>
+        </w:rPr>
+        <w:t>process_id</w:t>
+      </w:r>
+      <w:proofErr w:type="spellEnd"/>
+      <w:r>
+        <w:rPr>
+          <w:rFonts w:ascii="Times New Roman" w:hAnsi="Times New Roman" w:cs="Times New Roman"/>
+          <w:sz w:val="22"/>
+          <w:szCs w:val="22"/>
+        </w:rPr>
+        <w:t xml:space="preserve"> has memory allocated to it.</w:t>
+      </w:r>
+    </w:p>
+    <w:p>
+      <w:pPr>
+        <w:pStyle w:val="ListParagraph"/>
+        <w:numPr>
+          <w:ilvl w:val="2"/>
+          <w:numId w:val="2"/>
+        </w:numPr>
+        <w:rPr>
+          <w:rFonts w:ascii="Times New Roman" w:hAnsi="Times New Roman" w:cs="Times New Roman"/>
+          <w:sz w:val="22"/>
+          <w:szCs w:val="22"/>
+        </w:rPr>
+      </w:pPr>
+      <w:r>
+        <w:rPr>
+          <w:rFonts w:ascii="Times New Roman" w:hAnsi="Times New Roman" w:cs="Times New Roman"/>
+          <w:sz w:val="22"/>
+          <w:szCs w:val="22"/>
+        </w:rPr>
+        <w:t>u</w:t>
+      </w:r>
+      <w:r>
+        <w:rPr>
+          <w:rFonts w:ascii="Times New Roman" w:hAnsi="Times New Roman" w:cs="Times New Roman"/>
+          <w:sz w:val="22"/>
+          <w:szCs w:val="22"/>
+        </w:rPr>
+        <w:t xml:space="preserve">nsigned int </w:t>
+      </w:r>
+      <w:proofErr w:type="spellStart"/>
+      <w:r>
+        <w:rPr>
+          <w:rFonts w:ascii="Times New Roman" w:hAnsi="Times New Roman" w:cs="Times New Roman"/>
+          <w:sz w:val="22"/>
+          <w:szCs w:val="22"/>
+        </w:rPr>
+        <w:t>int</w:t>
+      </w:r>
+      <w:proofErr w:type="spellEnd"/>
+      <w:r>
+        <w:rPr>
+          <w:rFonts w:ascii="Times New Roman" w:hAnsi="Times New Roman" w:cs="Times New Roman"/>
+          <w:sz w:val="22"/>
+          <w:szCs w:val="22"/>
+        </w:rPr>
+        <w:t xml:space="preserve"> </w:t>
+      </w:r>
+      <w:proofErr w:type="spellStart"/>
+      <w:proofErr w:type="gramStart"/>
+      <w:r>
+        <w:rPr>
+          <w:rFonts w:ascii="Times New Roman" w:hAnsi="Times New Roman" w:cs="Times New Roman"/>
+          <w:sz w:val="22"/>
+          <w:szCs w:val="22"/>
+        </w:rPr>
+        <w:t>countHoles</w:t>
+      </w:r>
+      <w:proofErr w:type="spellEnd"/>
+      <w:r>
+        <w:rPr>
+          <w:rFonts w:ascii="Times New Roman" w:hAnsi="Times New Roman" w:cs="Times New Roman"/>
+          <w:sz w:val="22"/>
+          <w:szCs w:val="22"/>
+        </w:rPr>
+        <w:t>( )</w:t>
+      </w:r>
+      <w:proofErr w:type="gramEnd"/>
+      <w:r>
+        <w:rPr>
+          <w:rFonts w:ascii="Times New Roman" w:hAnsi="Times New Roman" w:cs="Times New Roman"/>
+          <w:sz w:val="22"/>
+          <w:szCs w:val="22"/>
+        </w:rPr>
+        <w:t>: returns the number of holes (fragments of sizes 1 or 2 units).</w:t>
+      </w:r>
+    </w:p>
+    <w:p>
+      <w:pPr>
+        <w:pStyle w:val="ListParagraph"/>
+        <w:numPr>
+          <w:ilvl w:val="2"/>
+          <w:numId w:val="2"/>
+        </w:numPr>
+        <w:rPr>
+          <w:rFonts w:ascii="Times New Roman" w:hAnsi="Times New Roman" w:cs="Times New Roman"/>
+          <w:sz w:val="22"/>
+          <w:szCs w:val="22"/>
+        </w:rPr>
+      </w:pPr>
+      <w:r>
+        <w:rPr>
+          <w:rFonts w:ascii="Times New Roman" w:hAnsi="Times New Roman" w:cs="Times New Roman"/>
+          <w:sz w:val="22"/>
+          <w:szCs w:val="22"/>
+        </w:rPr>
+        <w:t xml:space="preserve">void </w:t>
+      </w:r>
+      <w:proofErr w:type="spellStart"/>
+      <w:proofErr w:type="gramStart"/>
+      <w:r>
+        <w:rPr>
+          <w:rFonts w:ascii="Times New Roman" w:hAnsi="Times New Roman" w:cs="Times New Roman"/>
+          <w:sz w:val="22"/>
+          <w:szCs w:val="22"/>
+        </w:rPr>
+        <w:t>checkLL</w:t>
+      </w:r>
+      <w:proofErr w:type="spellEnd"/>
+      <w:r>
+        <w:rPr>
+          <w:rFonts w:ascii="Times New Roman" w:hAnsi="Times New Roman" w:cs="Times New Roman"/>
+          <w:sz w:val="22"/>
+          <w:szCs w:val="22"/>
+        </w:rPr>
+        <w:t>(</w:t>
+      </w:r>
+      <w:proofErr w:type="gramEnd"/>
+      <w:r>
+        <w:rPr>
+          <w:rFonts w:ascii="Times New Roman" w:hAnsi="Times New Roman" w:cs="Times New Roman"/>
+          <w:sz w:val="22"/>
+          <w:szCs w:val="22"/>
+        </w:rPr>
+        <w:t xml:space="preserve">); </w:t>
+      </w:r>
+      <w:r>
+        <w:rPr>
+          <w:rFonts w:ascii="Times New Roman" w:hAnsi="Times New Roman" w:cs="Times New Roman"/>
+          <w:sz w:val="22"/>
+          <w:szCs w:val="22"/>
+        </w:rPr>
+        <w:t xml:space="preserve">checks the integrity of the </w:t>
+      </w:r>
+      <w:proofErr w:type="gramStart"/>
+      <w:r>
+        <w:rPr>
+          <w:rFonts w:ascii="Times New Roman" w:hAnsi="Times New Roman" w:cs="Times New Roman"/>
+          <w:sz w:val="22"/>
+          <w:szCs w:val="22"/>
+        </w:rPr>
+        <w:t>doubly-linked</w:t>
+      </w:r>
+      <w:proofErr w:type="gramEnd"/>
+      <w:r>
+        <w:rPr>
+          <w:rFonts w:ascii="Times New Roman" w:hAnsi="Times New Roman" w:cs="Times New Roman"/>
+          <w:sz w:val="22"/>
+          <w:szCs w:val="22"/>
+        </w:rPr>
+        <w:t xml:space="preserve"> list for improper linkages and length.</w:t>
+      </w:r>
+      <w:r>
+        <w:rPr>
+          <w:rFonts w:ascii="Times New Roman" w:hAnsi="Times New Roman" w:cs="Times New Roman"/>
+          <w:sz w:val="22"/>
+          <w:szCs w:val="22"/>
+        </w:rPr>
+        <w:t xml:space="preserve"> If the list is found to be out of order, the program shall </w:t>
+      </w:r>
+      <w:proofErr w:type="gramStart"/>
+      <w:r>
+        <w:rPr>
+          <w:rFonts w:ascii="Times New Roman" w:hAnsi="Times New Roman" w:cs="Times New Roman"/>
+          <w:sz w:val="22"/>
+          <w:szCs w:val="22"/>
+        </w:rPr>
+        <w:t>exit</w:t>
+      </w:r>
+      <w:proofErr w:type="gramEnd"/>
+      <w:r>
+        <w:rPr>
+          <w:rFonts w:ascii="Times New Roman" w:hAnsi="Times New Roman" w:cs="Times New Roman"/>
+          <w:sz w:val="22"/>
+          <w:szCs w:val="22"/>
+        </w:rPr>
+        <w:t xml:space="preserve"> with an error message identifying at which node in the list the issue was found and </w:t>
+      </w:r>
+      <w:r>
+        <w:rPr>
+          <w:rFonts w:ascii="Times New Roman" w:hAnsi="Times New Roman" w:cs="Times New Roman"/>
+          <w:sz w:val="22"/>
+          <w:szCs w:val="22"/>
+        </w:rPr>
+        <w:t xml:space="preserve">how many nodes were on the list. The first node shall always have a previous pointer pointing to NULL, while the last node shall always have a </w:t>
+      </w:r>
+      <w:r>
+        <w:rPr>
+          <w:rFonts w:ascii="Times New Roman" w:hAnsi="Times New Roman" w:cs="Times New Roman"/>
+          <w:sz w:val="22"/>
+          <w:szCs w:val="22"/>
+        </w:rPr>
+        <w:t>next pointer pointing to NULL.</w:t>
+      </w:r>
+      <w:r>
+        <w:rPr>
+          <w:rFonts w:ascii="Times New Roman" w:hAnsi="Times New Roman" w:cs="Times New Roman"/>
+          <w:sz w:val="22"/>
+          <w:szCs w:val="22"/>
+        </w:rPr>
+        <w:t xml:space="preserve"> This shall always be called by the main function after every </w:t>
+      </w:r>
+      <w:r>
+        <w:rPr>
+          <w:rFonts w:ascii="Times New Roman" w:hAnsi="Times New Roman" w:cs="Times New Roman"/>
+          <w:sz w:val="22"/>
+          <w:szCs w:val="22"/>
+        </w:rPr>
+        <w:t>memory allocation attempt and every deallocation attempt.</w:t>
+      </w:r>
+    </w:p>
+    <w:p>
+      <w:pPr>
+        <w:pStyle w:val="ListParagraph"/>
+        <w:numPr>
+          <w:ilvl w:val="2"/>
+          <w:numId w:val="2"/>
+        </w:numPr>
+        <w:rPr>
+          <w:rFonts w:ascii="Times New Roman" w:hAnsi="Times New Roman" w:cs="Times New Roman"/>
+          <w:sz w:val="22"/>
+          <w:szCs w:val="22"/>
+        </w:rPr>
+      </w:pPr>
+      <w:r>
+        <w:rPr>
+          <w:rFonts w:ascii="Times New Roman" w:hAnsi="Times New Roman" w:cs="Times New Roman"/>
+          <w:sz w:val="22"/>
+          <w:szCs w:val="22"/>
+        </w:rPr>
+        <w:t xml:space="preserve">void </w:t>
+      </w:r>
+      <w:proofErr w:type="spellStart"/>
+      <w:proofErr w:type="gramStart"/>
+      <w:r>
+        <w:rPr>
+          <w:rFonts w:ascii="Times New Roman" w:hAnsi="Times New Roman" w:cs="Times New Roman"/>
+          <w:sz w:val="22"/>
+          <w:szCs w:val="22"/>
+        </w:rPr>
+        <w:t>printIt</w:t>
+      </w:r>
+      <w:proofErr w:type="spellEnd"/>
+      <w:r>
+        <w:rPr>
+          <w:rFonts w:ascii="Times New Roman" w:hAnsi="Times New Roman" w:cs="Times New Roman"/>
+          <w:sz w:val="22"/>
+          <w:szCs w:val="22"/>
+        </w:rPr>
+        <w:t>(</w:t>
+      </w:r>
+      <w:proofErr w:type="gramEnd"/>
+      <w:r>
+        <w:rPr>
+          <w:rFonts w:ascii="Times New Roman" w:hAnsi="Times New Roman" w:cs="Times New Roman"/>
+          <w:sz w:val="22"/>
+          <w:szCs w:val="22"/>
+        </w:rPr>
+        <w:t xml:space="preserve">); prints the </w:t>
+      </w:r>
+      <w:proofErr w:type="gramStart"/>
+      <w:r>
+        <w:rPr>
+          <w:rFonts w:ascii="Times New Roman" w:hAnsi="Times New Roman" w:cs="Times New Roman"/>
+          <w:sz w:val="22"/>
+          <w:szCs w:val="22"/>
+        </w:rPr>
+        <w:t>doubly-linked</w:t>
+      </w:r>
+      <w:proofErr w:type="gramEnd"/>
+      <w:r>
+        <w:rPr>
+          <w:rFonts w:ascii="Times New Roman" w:hAnsi="Times New Roman" w:cs="Times New Roman"/>
+          <w:sz w:val="22"/>
+          <w:szCs w:val="22"/>
+        </w:rPr>
+        <w:t xml:space="preserve"> list, starting at the beginning, </w:t>
+      </w:r>
+      <w:r>
+        <w:rPr>
+          <w:rFonts w:ascii="Times New Roman" w:hAnsi="Times New Roman" w:cs="Times New Roman"/>
+          <w:sz w:val="22"/>
+          <w:szCs w:val="22"/>
+        </w:rPr>
+        <w:t>each node’s set of attributes on a single line, one node per line.</w:t>
+      </w:r>
+      <w:r>
+        <w:rPr>
+          <w:rFonts w:ascii="Times New Roman" w:hAnsi="Times New Roman" w:cs="Times New Roman"/>
+          <w:sz w:val="22"/>
+          <w:szCs w:val="22"/>
+        </w:rPr>
+        <w:t xml:space="preserve"> This is for diagnostics purposes and shall not be called in the final submissible form of the program.</w:t>
+      </w:r>
+    </w:p>
+    <w:p>
+      <w:pPr>
+        <w:pStyle w:val="ListParagraph"/>
+        <w:numPr>
+          <w:ilvl w:val="0"/>
+          <w:numId w:val="2"/>
+        </w:numPr>
+        <w:rPr>
+          <w:rFonts w:ascii="Times New Roman" w:hAnsi="Times New Roman" w:cs="Times New Roman"/>
+          <w:sz w:val="22"/>
+          <w:szCs w:val="22"/>
+        </w:rPr>
+      </w:pPr>
+      <w:r>
+        <w:rPr>
+          <w:rFonts w:ascii="Times New Roman" w:hAnsi="Times New Roman" w:cs="Times New Roman"/>
+          <w:sz w:val="22"/>
+          <w:szCs w:val="22"/>
+        </w:rPr>
+        <w:t>list:</w:t>
       </w:r>
     </w:p>
     <w:p>
@@ -925,31 +1804,7 @@
           <w:sz w:val="22"/>
           <w:szCs w:val="22"/>
         </w:rPr>
-        <w:t>Public</w:t>
-      </w:r>
-      <w:r>
-        <w:rPr>
-          <w:rFonts w:ascii="Times New Roman" w:hAnsi="Times New Roman" w:cs="Times New Roman"/>
-          <w:sz w:val="22"/>
-          <w:szCs w:val="22"/>
-        </w:rPr>
-        <w:t xml:space="preserve"> member </w:t>
-      </w:r>
-      <w:r>
-        <w:rPr>
-          <w:rFonts w:ascii="Times New Roman" w:hAnsi="Times New Roman" w:cs="Times New Roman"/>
-          <w:sz w:val="22"/>
-          <w:szCs w:val="22"/>
-        </w:rPr>
-        <w:t>functions</w:t>
-      </w:r>
-      <w:r>
-        <w:rPr>
-          <w:rFonts w:ascii="Times New Roman" w:hAnsi="Times New Roman" w:cs="Times New Roman"/>
-          <w:sz w:val="22"/>
-          <w:szCs w:val="22"/>
-        </w:rPr>
-        <w:t>:</w:t>
+        <w:t>Private member variables:</w:t>
       </w:r>
     </w:p>
     <w:p>
@@ -971,15 +1826,15 @@
           <w:sz w:val="22"/>
           <w:szCs w:val="22"/>
         </w:rPr>
-        <w:t>memManager(unsigned int policy, unsigned int blockCount; constructor that builds an object that will use the given policy for a memory of the given number of blocks</w:t>
-      </w:r>
-      <w:r>
-        <w:rPr>
-          <w:rFonts w:ascii="Times New Roman" w:hAnsi="Times New Roman" w:cs="Times New Roman"/>
-          <w:sz w:val="22"/>
-          <w:szCs w:val="22"/>
-        </w:rPr>
-        <w:t>, 128 in the final submission.</w:t>
+        <w:t xml:space="preserve">unsigned int </w:t>
+      </w:r>
+      <w:r>
+        <w:rPr>
+          <w:rFonts w:ascii="Times New Roman" w:hAnsi="Times New Roman" w:cs="Times New Roman"/>
+          <w:sz w:val="22"/>
+          <w:szCs w:val="22"/>
+        </w:rPr>
+        <w:t>*a; the array to hold the list contents</w:t>
       </w:r>
     </w:p>
     <w:p>
@@ -1001,8 +1856,91 @@
           <w:sz w:val="22"/>
           <w:szCs w:val="22"/>
         </w:rPr>
-        <w:lastRenderedPageBreak/>
-        <w:t>~memManager(); the destructor</w:t>
+        <w:t xml:space="preserve">unsigned int </w:t>
+      </w:r>
+      <w:proofErr w:type="spellStart"/>
+      <w:r>
+        <w:rPr>
+          <w:rFonts w:ascii="Times New Roman" w:hAnsi="Times New Roman" w:cs="Times New Roman"/>
+          <w:sz w:val="22"/>
+          <w:szCs w:val="22"/>
+        </w:rPr>
+        <w:t>listCount</w:t>
+      </w:r>
+      <w:proofErr w:type="spellEnd"/>
+      <w:r>
+        <w:rPr>
+          <w:rFonts w:ascii="Times New Roman" w:hAnsi="Times New Roman" w:cs="Times New Roman"/>
+          <w:sz w:val="22"/>
+          <w:szCs w:val="22"/>
+        </w:rPr>
+        <w:t xml:space="preserve">, </w:t>
+      </w:r>
+      <w:proofErr w:type="spellStart"/>
+      <w:r>
+        <w:rPr>
+          <w:rFonts w:ascii="Times New Roman" w:hAnsi="Times New Roman" w:cs="Times New Roman"/>
+          <w:sz w:val="22"/>
+          <w:szCs w:val="22"/>
+        </w:rPr>
+        <w:t>listCapacity</w:t>
+      </w:r>
+      <w:proofErr w:type="spellEnd"/>
+      <w:r>
+        <w:rPr>
+          <w:rFonts w:ascii="Times New Roman" w:hAnsi="Times New Roman" w:cs="Times New Roman"/>
+          <w:sz w:val="22"/>
+          <w:szCs w:val="22"/>
+        </w:rPr>
+        <w:t>;</w:t>
+      </w:r>
+      <w:r>
+        <w:rPr>
+          <w:rFonts w:ascii="Times New Roman" w:hAnsi="Times New Roman" w:cs="Times New Roman"/>
+          <w:sz w:val="22"/>
+          <w:szCs w:val="22"/>
+        </w:rPr>
+        <w:t xml:space="preserve"> the number of items on the list and the list’s capacity.</w:t>
+      </w:r>
+    </w:p>
+    <w:p>
+      <w:pPr>
+        <w:pStyle w:val="ListParagraph"/>
+        <w:numPr>
+          <w:ilvl w:val="1"/>
+          <w:numId w:val="2"/>
+        </w:numPr>
+        <w:rPr>
+          <w:rFonts w:ascii="Times New Roman" w:hAnsi="Times New Roman" w:cs="Times New Roman"/>
+          <w:sz w:val="22"/>
+          <w:szCs w:val="22"/>
+        </w:rPr>
+      </w:pPr>
+      <w:r>
+        <w:rPr>
+          <w:rFonts w:ascii="Times New Roman" w:hAnsi="Times New Roman" w:cs="Times New Roman"/>
+          <w:sz w:val="22"/>
+          <w:szCs w:val="22"/>
+        </w:rPr>
+        <w:t xml:space="preserve">Public </w:t>
+      </w:r>
+      <w:proofErr w:type="gramStart"/>
+      <w:r>
+        <w:rPr>
+          <w:rFonts w:ascii="Times New Roman" w:hAnsi="Times New Roman" w:cs="Times New Roman"/>
+          <w:sz w:val="22"/>
+          <w:szCs w:val="22"/>
+        </w:rPr>
+        <w:t>member functions</w:t>
+      </w:r>
+      <w:proofErr w:type="gramEnd"/>
+      <w:r>
+        <w:rPr>
+          <w:rFonts w:ascii="Times New Roman" w:hAnsi="Times New Roman" w:cs="Times New Roman"/>
+          <w:sz w:val="22"/>
+          <w:szCs w:val="22"/>
+        </w:rPr>
+        <w:t>:</w:t>
       </w:r>
     </w:p>
     <w:p>
@@ -1018,29 +1956,41 @@
           <w:szCs w:val="22"/>
         </w:rPr>
       </w:pPr>
-      <w:r>
-        <w:rPr>
-          <w:rFonts w:ascii="Times New Roman" w:hAnsi="Times New Roman" w:cs="Times New Roman"/>
-          <w:sz w:val="22"/>
-          <w:szCs w:val="22"/>
-        </w:rPr>
-        <w:t xml:space="preserve">int </w:t>
-      </w:r>
-      <w:r>
-        <w:rPr>
-          <w:rFonts w:ascii="Times New Roman" w:hAnsi="Times New Roman" w:cs="Times New Roman"/>
-          <w:sz w:val="22"/>
-          <w:szCs w:val="22"/>
-        </w:rPr>
-        <w:t>allocMem</w:t>
-      </w:r>
-      <w:r>
-        <w:rPr>
-          <w:rFonts w:ascii="Times New Roman" w:hAnsi="Times New Roman" w:cs="Times New Roman"/>
-          <w:sz w:val="22"/>
-          <w:szCs w:val="22"/>
-        </w:rPr>
-        <w:t xml:space="preserve"> (int process_id, int num_units): allocates num_units units of memory to a process whose id is process_id. If successful, it returns the number of nodes traversed in the linked list. Otherwise, it returns -1.</w:t>
+      <w:proofErr w:type="gramStart"/>
+      <w:r>
+        <w:rPr>
+          <w:rFonts w:ascii="Times New Roman" w:hAnsi="Times New Roman" w:cs="Times New Roman"/>
+          <w:sz w:val="22"/>
+          <w:szCs w:val="22"/>
+        </w:rPr>
+        <w:t>list(</w:t>
+      </w:r>
+      <w:proofErr w:type="gramEnd"/>
+      <w:r>
+        <w:rPr>
+          <w:rFonts w:ascii="Times New Roman" w:hAnsi="Times New Roman" w:cs="Times New Roman"/>
+          <w:sz w:val="22"/>
+          <w:szCs w:val="22"/>
+        </w:rPr>
+        <w:t xml:space="preserve">unsigned </w:t>
+      </w:r>
+      <w:proofErr w:type="spellStart"/>
+      <w:r>
+        <w:rPr>
+          <w:rFonts w:ascii="Times New Roman" w:hAnsi="Times New Roman" w:cs="Times New Roman"/>
+          <w:sz w:val="22"/>
+          <w:szCs w:val="22"/>
+        </w:rPr>
+        <w:t>listCapacity</w:t>
+      </w:r>
+      <w:proofErr w:type="spellEnd"/>
+      <w:r>
+        <w:rPr>
+          <w:rFonts w:ascii="Times New Roman" w:hAnsi="Times New Roman" w:cs="Times New Roman"/>
+          <w:sz w:val="22"/>
+          <w:szCs w:val="22"/>
+        </w:rPr>
+        <w:t>); the constructor</w:t>
       </w:r>
     </w:p>
     <w:p>
@@ -1062,47 +2012,25 @@
           <w:sz w:val="22"/>
           <w:szCs w:val="22"/>
         </w:rPr>
-        <w:t>void</w:t>
-      </w:r>
-      <w:r>
-        <w:rPr>
-          <w:rFonts w:ascii="Times New Roman" w:hAnsi="Times New Roman" w:cs="Times New Roman"/>
-          <w:sz w:val="22"/>
-          <w:szCs w:val="22"/>
-        </w:rPr>
-        <w:t xml:space="preserve"> </w:t>
-      </w:r>
-      <w:r>
-        <w:rPr>
-          <w:rFonts w:ascii="Times New Roman" w:hAnsi="Times New Roman" w:cs="Times New Roman"/>
-          <w:sz w:val="22"/>
-          <w:szCs w:val="22"/>
-        </w:rPr>
-        <w:t>deallocMem</w:t>
-      </w:r>
-      <w:r>
-        <w:rPr>
-          <w:rFonts w:ascii="Times New Roman" w:hAnsi="Times New Roman" w:cs="Times New Roman"/>
-          <w:sz w:val="22"/>
-          <w:szCs w:val="22"/>
-        </w:rPr>
-        <w:t xml:space="preserve"> (int process_id): deallocates the memory allocated to the process whose id is process_id</w:t>
-      </w:r>
-      <w:r>
-        <w:rPr>
-          <w:rFonts w:ascii="Times New Roman" w:hAnsi="Times New Roman" w:cs="Times New Roman"/>
-          <w:sz w:val="22"/>
-          <w:szCs w:val="22"/>
-        </w:rPr>
-        <w:t xml:space="preserve">, if that </w:t>
-      </w:r>
-      <w:r>
-        <w:rPr>
-          <w:rFonts w:ascii="Times New Roman" w:hAnsi="Times New Roman" w:cs="Times New Roman"/>
-          <w:sz w:val="22"/>
-          <w:szCs w:val="22"/>
-        </w:rPr>
-        <w:t>process_id has memory allocated to it.</w:t>
+        <w:t>~</w:t>
+      </w:r>
+      <w:proofErr w:type="gramStart"/>
+      <w:r>
+        <w:rPr>
+          <w:rFonts w:ascii="Times New Roman" w:hAnsi="Times New Roman" w:cs="Times New Roman"/>
+          <w:sz w:val="22"/>
+          <w:szCs w:val="22"/>
+        </w:rPr>
+        <w:t>list(</w:t>
+      </w:r>
+      <w:proofErr w:type="gramEnd"/>
+      <w:r>
+        <w:rPr>
+          <w:rFonts w:ascii="Times New Roman" w:hAnsi="Times New Roman" w:cs="Times New Roman"/>
+          <w:sz w:val="22"/>
+          <w:szCs w:val="22"/>
+        </w:rPr>
+        <w:t>); the destructor</w:t>
       </w:r>
     </w:p>
     <w:p>
@@ -1124,16 +2052,18 @@
           <w:sz w:val="22"/>
           <w:szCs w:val="22"/>
         </w:rPr>
-        <w:t>u</w:t>
-      </w:r>
-      <w:r>
-        <w:rPr>
-          <w:rFonts w:ascii="Times New Roman" w:hAnsi="Times New Roman" w:cs="Times New Roman"/>
-          <w:sz w:val="22"/>
-          <w:szCs w:val="22"/>
-        </w:rPr>
-        <w:t xml:space="preserve">nsigned int </w:t>
-      </w:r>
+        <w:t xml:space="preserve">bool </w:t>
+      </w:r>
+      <w:proofErr w:type="gramStart"/>
+      <w:r>
+        <w:rPr>
+          <w:rFonts w:ascii="Times New Roman" w:hAnsi="Times New Roman" w:cs="Times New Roman"/>
+          <w:sz w:val="22"/>
+          <w:szCs w:val="22"/>
+        </w:rPr>
+        <w:t>add(</w:t>
+      </w:r>
+      <w:proofErr w:type="gramEnd"/>
       <w:r>
         <w:rPr>
           <w:rFonts w:ascii="Times New Roman" w:hAnsi="Times New Roman" w:cs="Times New Roman"/>
@@ -1142,21 +2072,41 @@
         </w:rPr>
         <w:t xml:space="preserve">int </w:t>
       </w:r>
-      <w:r>
-        <w:rPr>
-          <w:rFonts w:ascii="Times New Roman" w:hAnsi="Times New Roman" w:cs="Times New Roman"/>
-          <w:sz w:val="22"/>
-          <w:szCs w:val="22"/>
-        </w:rPr>
-        <w:t>countHoles</w:t>
-      </w:r>
-      <w:r>
-        <w:rPr>
-          <w:rFonts w:ascii="Times New Roman" w:hAnsi="Times New Roman" w:cs="Times New Roman"/>
-          <w:sz w:val="22"/>
-          <w:szCs w:val="22"/>
-        </w:rPr>
-        <w:t>( ): returns the number of holes (fragments of sizes 1 or 2 units).</w:t>
+      <w:proofErr w:type="spellStart"/>
+      <w:r>
+        <w:rPr>
+          <w:rFonts w:ascii="Times New Roman" w:hAnsi="Times New Roman" w:cs="Times New Roman"/>
+          <w:sz w:val="22"/>
+          <w:szCs w:val="22"/>
+        </w:rPr>
+        <w:t>val</w:t>
+      </w:r>
+      <w:proofErr w:type="spellEnd"/>
+      <w:r>
+        <w:rPr>
+          <w:rFonts w:ascii="Times New Roman" w:hAnsi="Times New Roman" w:cs="Times New Roman"/>
+          <w:sz w:val="22"/>
+          <w:szCs w:val="22"/>
+        </w:rPr>
+        <w:t xml:space="preserve">); adds </w:t>
+      </w:r>
+      <w:proofErr w:type="spellStart"/>
+      <w:r>
+        <w:rPr>
+          <w:rFonts w:ascii="Times New Roman" w:hAnsi="Times New Roman" w:cs="Times New Roman"/>
+          <w:sz w:val="22"/>
+          <w:szCs w:val="22"/>
+        </w:rPr>
+        <w:t>val</w:t>
+      </w:r>
+      <w:proofErr w:type="spellEnd"/>
+      <w:r>
+        <w:rPr>
+          <w:rFonts w:ascii="Times New Roman" w:hAnsi="Times New Roman" w:cs="Times New Roman"/>
+          <w:sz w:val="22"/>
+          <w:szCs w:val="22"/>
+        </w:rPr>
+        <w:t xml:space="preserve"> to the end of the list in constant time; returns true if the list has capacity to do the addition, false otherwise.</w:t>
       </w:r>
     </w:p>
     <w:p>
@@ -1178,55 +2128,77 @@
           <w:sz w:val="22"/>
           <w:szCs w:val="22"/>
         </w:rPr>
-        <w:t xml:space="preserve">void checkLL(); </w:t>
-      </w:r>
-      <w:r>
-        <w:rPr>
-          <w:rFonts w:ascii="Times New Roman" w:hAnsi="Times New Roman" w:cs="Times New Roman"/>
-          <w:sz w:val="22"/>
-          <w:szCs w:val="22"/>
-        </w:rPr>
-        <w:t>checks the integrity of the doubly-linked list for improper linkages and length.</w:t>
-      </w:r>
-      <w:r>
-        <w:rPr>
-          <w:rFonts w:ascii="Times New Roman" w:hAnsi="Times New Roman" w:cs="Times New Roman"/>
-          <w:sz w:val="22"/>
-          <w:szCs w:val="22"/>
-        </w:rPr>
-        <w:t xml:space="preserve"> If the list is found to be out of order, the program shall exit with an error message identifying at which node in the list the issue was found and </w:t>
-      </w:r>
-      <w:r>
-        <w:rPr>
-          <w:rFonts w:ascii="Times New Roman" w:hAnsi="Times New Roman" w:cs="Times New Roman"/>
-          <w:sz w:val="22"/>
-          <w:szCs w:val="22"/>
-        </w:rPr>
-        <w:t xml:space="preserve">how many nodes were on the list. The first node shall always have a previous pointer pointing to NULL, while the last node shall always have a </w:t>
-      </w:r>
-      <w:r>
-        <w:rPr>
-          <w:rFonts w:ascii="Times New Roman" w:hAnsi="Times New Roman" w:cs="Times New Roman"/>
-          <w:sz w:val="22"/>
-          <w:szCs w:val="22"/>
-        </w:rPr>
-        <w:t>next pointer pointing to NULL.</w:t>
-      </w:r>
-      <w:r>
-        <w:rPr>
-          <w:rFonts w:ascii="Times New Roman" w:hAnsi="Times New Roman" w:cs="Times New Roman"/>
-          <w:sz w:val="22"/>
-          <w:szCs w:val="22"/>
-        </w:rPr>
-        <w:t xml:space="preserve"> This shall always be called by the main function after every </w:t>
-      </w:r>
-      <w:r>
-        <w:rPr>
-          <w:rFonts w:ascii="Times New Roman" w:hAnsi="Times New Roman" w:cs="Times New Roman"/>
-          <w:sz w:val="22"/>
-          <w:szCs w:val="22"/>
-        </w:rPr>
-        <w:t>memory allocation attempt and every deallocation attempt.</w:t>
+        <w:t xml:space="preserve">bool </w:t>
+      </w:r>
+      <w:proofErr w:type="spellStart"/>
+      <w:proofErr w:type="gramStart"/>
+      <w:r>
+        <w:rPr>
+          <w:rFonts w:ascii="Times New Roman" w:hAnsi="Times New Roman" w:cs="Times New Roman"/>
+          <w:sz w:val="22"/>
+          <w:szCs w:val="22"/>
+        </w:rPr>
+        <w:t>deleteAt</w:t>
+      </w:r>
+      <w:proofErr w:type="spellEnd"/>
+      <w:r>
+        <w:rPr>
+          <w:rFonts w:ascii="Times New Roman" w:hAnsi="Times New Roman" w:cs="Times New Roman"/>
+          <w:sz w:val="22"/>
+          <w:szCs w:val="22"/>
+        </w:rPr>
+        <w:t>(</w:t>
+      </w:r>
+      <w:proofErr w:type="gramEnd"/>
+      <w:r>
+        <w:rPr>
+          <w:rFonts w:ascii="Times New Roman" w:hAnsi="Times New Roman" w:cs="Times New Roman"/>
+          <w:sz w:val="22"/>
+          <w:szCs w:val="22"/>
+        </w:rPr>
+        <w:t xml:space="preserve">unsigned int index); </w:t>
+      </w:r>
+      <w:r>
+        <w:rPr>
+          <w:rFonts w:ascii="Times New Roman" w:hAnsi="Times New Roman" w:cs="Times New Roman"/>
+          <w:sz w:val="22"/>
+          <w:szCs w:val="22"/>
+        </w:rPr>
+        <w:t xml:space="preserve">if the index is valid, it </w:t>
+      </w:r>
+      <w:r>
+        <w:rPr>
+          <w:rFonts w:ascii="Times New Roman" w:hAnsi="Times New Roman" w:cs="Times New Roman"/>
+          <w:sz w:val="22"/>
+          <w:szCs w:val="22"/>
+        </w:rPr>
+        <w:t xml:space="preserve">deletes the </w:t>
+      </w:r>
+      <w:r>
+        <w:rPr>
+          <w:rFonts w:ascii="Times New Roman" w:hAnsi="Times New Roman" w:cs="Times New Roman"/>
+          <w:sz w:val="22"/>
+          <w:szCs w:val="22"/>
+        </w:rPr>
+        <w:t xml:space="preserve">list entry specified by index, replacing that entry with what’s currently at the end of the list, and returns true. </w:t>
+      </w:r>
+      <w:proofErr w:type="spellStart"/>
+      <w:r>
+        <w:rPr>
+          <w:rFonts w:ascii="Times New Roman" w:hAnsi="Times New Roman" w:cs="Times New Roman"/>
+          <w:sz w:val="22"/>
+          <w:szCs w:val="22"/>
+        </w:rPr>
+        <w:t>Oherwise</w:t>
+      </w:r>
+      <w:proofErr w:type="spellEnd"/>
+      <w:r>
+        <w:rPr>
+          <w:rFonts w:ascii="Times New Roman" w:hAnsi="Times New Roman" w:cs="Times New Roman"/>
+          <w:sz w:val="22"/>
+          <w:szCs w:val="22"/>
+        </w:rPr>
+        <w:t xml:space="preserve"> returns false.</w:t>
       </w:r>
     </w:p>
     <w:p>
@@ -1248,23 +2220,186 @@
           <w:sz w:val="22"/>
           <w:szCs w:val="22"/>
         </w:rPr>
-        <w:t xml:space="preserve">void printIt(); prints the doubly-linked list, starting at the beginning, </w:t>
-      </w:r>
-      <w:r>
-        <w:rPr>
-          <w:rFonts w:ascii="Times New Roman" w:hAnsi="Times New Roman" w:cs="Times New Roman"/>
-          <w:sz w:val="22"/>
-          <w:szCs w:val="22"/>
-        </w:rPr>
-        <w:t>each node’s set of attributes on a single line, one node per line.</w:t>
-      </w:r>
-      <w:r>
-        <w:rPr>
-          <w:rFonts w:ascii="Times New Roman" w:hAnsi="Times New Roman" w:cs="Times New Roman"/>
-          <w:sz w:val="22"/>
-          <w:szCs w:val="22"/>
-        </w:rPr>
-        <w:t xml:space="preserve"> This is for diagnostics purposes and shall not be called in the final submissible form of the program.</w:t>
+        <w:t xml:space="preserve">int </w:t>
+      </w:r>
+      <w:proofErr w:type="spellStart"/>
+      <w:proofErr w:type="gramStart"/>
+      <w:r>
+        <w:rPr>
+          <w:rFonts w:ascii="Times New Roman" w:hAnsi="Times New Roman" w:cs="Times New Roman"/>
+          <w:sz w:val="22"/>
+          <w:szCs w:val="22"/>
+        </w:rPr>
+        <w:t>readAt</w:t>
+      </w:r>
+      <w:proofErr w:type="spellEnd"/>
+      <w:r>
+        <w:rPr>
+          <w:rFonts w:ascii="Times New Roman" w:hAnsi="Times New Roman" w:cs="Times New Roman"/>
+          <w:sz w:val="22"/>
+          <w:szCs w:val="22"/>
+        </w:rPr>
+        <w:t>(</w:t>
+      </w:r>
+      <w:proofErr w:type="gramEnd"/>
+      <w:r>
+        <w:rPr>
+          <w:rFonts w:ascii="Times New Roman" w:hAnsi="Times New Roman" w:cs="Times New Roman"/>
+          <w:sz w:val="22"/>
+          <w:szCs w:val="22"/>
+        </w:rPr>
+        <w:t xml:space="preserve">unsigned int index) const; returns the value </w:t>
+      </w:r>
+      <w:r>
+        <w:rPr>
+          <w:rFonts w:ascii="Times New Roman" w:hAnsi="Times New Roman" w:cs="Times New Roman"/>
+          <w:sz w:val="22"/>
+          <w:szCs w:val="22"/>
+        </w:rPr>
+        <w:t xml:space="preserve">at that index, if index is valid, otherwise </w:t>
+      </w:r>
+      <w:r>
+        <w:rPr>
+          <w:rFonts w:ascii="Times New Roman" w:hAnsi="Times New Roman" w:cs="Times New Roman"/>
+          <w:sz w:val="22"/>
+          <w:szCs w:val="22"/>
+        </w:rPr>
+        <w:t>returns -1.</w:t>
+      </w:r>
+    </w:p>
+    <w:p>
+      <w:pPr>
+        <w:pStyle w:val="ListParagraph"/>
+        <w:numPr>
+          <w:ilvl w:val="2"/>
+          <w:numId w:val="2"/>
+        </w:numPr>
+        <w:rPr>
+          <w:rFonts w:ascii="Times New Roman" w:hAnsi="Times New Roman" w:cs="Times New Roman"/>
+          <w:sz w:val="22"/>
+          <w:szCs w:val="22"/>
+        </w:rPr>
+      </w:pPr>
+      <w:r>
+        <w:rPr>
+          <w:rFonts w:ascii="Times New Roman" w:hAnsi="Times New Roman" w:cs="Times New Roman"/>
+          <w:sz w:val="22"/>
+          <w:szCs w:val="22"/>
+        </w:rPr>
+        <w:t xml:space="preserve">void </w:t>
+      </w:r>
+      <w:proofErr w:type="spellStart"/>
+      <w:proofErr w:type="gramStart"/>
+      <w:r>
+        <w:rPr>
+          <w:rFonts w:ascii="Times New Roman" w:hAnsi="Times New Roman" w:cs="Times New Roman"/>
+          <w:sz w:val="22"/>
+          <w:szCs w:val="22"/>
+        </w:rPr>
+        <w:t>printIt</w:t>
+      </w:r>
+      <w:proofErr w:type="spellEnd"/>
+      <w:r>
+        <w:rPr>
+          <w:rFonts w:ascii="Times New Roman" w:hAnsi="Times New Roman" w:cs="Times New Roman"/>
+          <w:sz w:val="22"/>
+          <w:szCs w:val="22"/>
+        </w:rPr>
+        <w:t>(</w:t>
+      </w:r>
+      <w:proofErr w:type="gramEnd"/>
+      <w:r>
+        <w:rPr>
+          <w:rFonts w:ascii="Times New Roman" w:hAnsi="Times New Roman" w:cs="Times New Roman"/>
+          <w:sz w:val="22"/>
+          <w:szCs w:val="22"/>
+        </w:rPr>
+        <w:t>) const; prints the list, one entry per line; used only for debugging, and not for the final submission.</w:t>
+      </w:r>
+    </w:p>
+    <w:p>
+      <w:pPr>
+        <w:pStyle w:val="ListParagraph"/>
+        <w:numPr>
+          <w:ilvl w:val="2"/>
+          <w:numId w:val="2"/>
+        </w:numPr>
+        <w:rPr>
+          <w:rFonts w:ascii="Times New Roman" w:hAnsi="Times New Roman" w:cs="Times New Roman"/>
+          <w:sz w:val="22"/>
+          <w:szCs w:val="22"/>
+        </w:rPr>
+      </w:pPr>
+      <w:r>
+        <w:rPr>
+          <w:rFonts w:ascii="Times New Roman" w:hAnsi="Times New Roman" w:cs="Times New Roman"/>
+          <w:sz w:val="22"/>
+          <w:szCs w:val="22"/>
+        </w:rPr>
+        <w:t xml:space="preserve">unsigned </w:t>
+      </w:r>
+      <w:proofErr w:type="spellStart"/>
+      <w:proofErr w:type="gramStart"/>
+      <w:r>
+        <w:rPr>
+          <w:rFonts w:ascii="Times New Roman" w:hAnsi="Times New Roman" w:cs="Times New Roman"/>
+          <w:sz w:val="22"/>
+          <w:szCs w:val="22"/>
+        </w:rPr>
+        <w:t>getCount</w:t>
+      </w:r>
+      <w:proofErr w:type="spellEnd"/>
+      <w:r>
+        <w:rPr>
+          <w:rFonts w:ascii="Times New Roman" w:hAnsi="Times New Roman" w:cs="Times New Roman"/>
+          <w:sz w:val="22"/>
+          <w:szCs w:val="22"/>
+        </w:rPr>
+        <w:t>(</w:t>
+      </w:r>
+      <w:proofErr w:type="gramEnd"/>
+      <w:r>
+        <w:rPr>
+          <w:rFonts w:ascii="Times New Roman" w:hAnsi="Times New Roman" w:cs="Times New Roman"/>
+          <w:sz w:val="22"/>
+          <w:szCs w:val="22"/>
+        </w:rPr>
+        <w:t xml:space="preserve">); returns </w:t>
+      </w:r>
+      <w:proofErr w:type="spellStart"/>
+      <w:r>
+        <w:rPr>
+          <w:rFonts w:ascii="Times New Roman" w:hAnsi="Times New Roman" w:cs="Times New Roman"/>
+          <w:sz w:val="22"/>
+          <w:szCs w:val="22"/>
+        </w:rPr>
+        <w:t>listCount</w:t>
+      </w:r>
+      <w:proofErr w:type="spellEnd"/>
+      <w:r>
+        <w:rPr>
+          <w:rFonts w:ascii="Times New Roman" w:hAnsi="Times New Roman" w:cs="Times New Roman"/>
+          <w:sz w:val="22"/>
+          <w:szCs w:val="22"/>
+        </w:rPr>
+        <w:t>.</w:t>
+      </w:r>
+    </w:p>
+    <w:p>
+      <w:pPr>
+        <w:rPr>
+          <w:rFonts w:ascii="Times New Roman" w:hAnsi="Times New Roman" w:cs="Times New Roman"/>
+          <w:sz w:val="22"/>
+          <w:szCs w:val="22"/>
+        </w:rPr>
+      </w:pPr>
+      <w:r>
+        <w:rPr>
+          <w:rFonts w:ascii="Times New Roman" w:hAnsi="Times New Roman" w:cs="Times New Roman"/>
+          <w:sz w:val="22"/>
+          <w:szCs w:val="22"/>
+        </w:rPr>
+        <w:t>The main program shall:</w:t>
       </w:r>
     </w:p>
     <w:p>
@@ -1286,7 +2421,246 @@
           <w:sz w:val="22"/>
           <w:szCs w:val="22"/>
         </w:rPr>
-        <w:t>list:</w:t>
+        <w:t>Ca</w:t>
+      </w:r>
+      <w:r>
+        <w:rPr>
+          <w:rFonts w:ascii="Times New Roman" w:hAnsi="Times New Roman" w:cs="Times New Roman"/>
+          <w:sz w:val="22"/>
+          <w:szCs w:val="22"/>
+        </w:rPr>
+        <w:t>pture the program arguments from the command line, which shall be of the form:</w:t>
+      </w:r>
+    </w:p>
+    <w:p>
+      <w:pPr>
+        <w:pStyle w:val="ListParagraph"/>
+        <w:ind w:left="1440"/>
+        <w:rPr>
+          <w:rFonts w:ascii="Courier New" w:hAnsi="Courier New" w:cs="Courier New"/>
+          <w:sz w:val="22"/>
+          <w:szCs w:val="22"/>
+        </w:rPr>
+      </w:pPr>
+      <w:proofErr w:type="spellStart"/>
+      <w:r>
+        <w:rPr>
+          <w:rFonts w:ascii="Courier New" w:hAnsi="Courier New" w:cs="Courier New"/>
+          <w:sz w:val="22"/>
+          <w:szCs w:val="22"/>
+        </w:rPr>
+        <w:t>memSim</w:t>
+      </w:r>
+      <w:proofErr w:type="spellEnd"/>
+      <w:r>
+        <w:rPr>
+          <w:rFonts w:ascii="Courier New" w:hAnsi="Courier New" w:cs="Courier New"/>
+          <w:sz w:val="22"/>
+          <w:szCs w:val="22"/>
+        </w:rPr>
+        <w:t xml:space="preserve"> </w:t>
+      </w:r>
+      <w:proofErr w:type="spellStart"/>
+      <w:r>
+        <w:rPr>
+          <w:rFonts w:ascii="Courier New" w:hAnsi="Courier New" w:cs="Courier New"/>
+          <w:b/>
+          <w:bCs/>
+          <w:sz w:val="22"/>
+          <w:szCs w:val="22"/>
+        </w:rPr>
+        <w:t>numberOfRequests</w:t>
+      </w:r>
+      <w:proofErr w:type="spellEnd"/>
+      <w:r>
+        <w:rPr>
+          <w:rFonts w:ascii="Courier New" w:hAnsi="Courier New" w:cs="Courier New"/>
+          <w:sz w:val="22"/>
+          <w:szCs w:val="22"/>
+        </w:rPr>
+        <w:t xml:space="preserve"> </w:t>
+      </w:r>
+      <w:proofErr w:type="spellStart"/>
+      <w:r>
+        <w:rPr>
+          <w:rFonts w:ascii="Courier New" w:hAnsi="Courier New" w:cs="Courier New"/>
+          <w:b/>
+          <w:bCs/>
+          <w:sz w:val="22"/>
+          <w:szCs w:val="22"/>
+        </w:rPr>
+        <w:t>percentageOfAllocs</w:t>
+      </w:r>
+      <w:proofErr w:type="spellEnd"/>
+      <w:r>
+        <w:rPr>
+          <w:rFonts w:ascii="Courier New" w:hAnsi="Courier New" w:cs="Courier New"/>
+          <w:sz w:val="22"/>
+          <w:szCs w:val="22"/>
+        </w:rPr>
+        <w:t xml:space="preserve"> </w:t>
+      </w:r>
+      <w:proofErr w:type="spellStart"/>
+      <w:r>
+        <w:rPr>
+          <w:rFonts w:ascii="Courier New" w:hAnsi="Courier New" w:cs="Courier New"/>
+          <w:b/>
+          <w:bCs/>
+          <w:sz w:val="22"/>
+          <w:szCs w:val="22"/>
+        </w:rPr>
+        <w:t>randomSeed</w:t>
+      </w:r>
+      <w:proofErr w:type="spellEnd"/>
+    </w:p>
+    <w:p>
+      <w:pPr>
+        <w:pStyle w:val="ListParagraph"/>
+        <w:numPr>
+          <w:ilvl w:val="0"/>
+          <w:numId w:val="2"/>
+        </w:numPr>
+        <w:rPr>
+          <w:rFonts w:ascii="Times New Roman" w:hAnsi="Times New Roman" w:cs="Times New Roman"/>
+          <w:sz w:val="22"/>
+          <w:szCs w:val="22"/>
+        </w:rPr>
+      </w:pPr>
+      <w:r>
+        <w:rPr>
+          <w:rFonts w:ascii="Times New Roman" w:hAnsi="Times New Roman" w:cs="Times New Roman"/>
+          <w:sz w:val="22"/>
+          <w:szCs w:val="22"/>
+        </w:rPr>
+        <w:t xml:space="preserve">Instantiate a </w:t>
+      </w:r>
+      <w:proofErr w:type="spellStart"/>
+      <w:r>
+        <w:rPr>
+          <w:rFonts w:ascii="Times New Roman" w:hAnsi="Times New Roman" w:cs="Times New Roman"/>
+          <w:sz w:val="22"/>
+          <w:szCs w:val="22"/>
+        </w:rPr>
+        <w:t>memManager</w:t>
+      </w:r>
+      <w:proofErr w:type="spellEnd"/>
+      <w:r>
+        <w:rPr>
+          <w:rFonts w:ascii="Times New Roman" w:hAnsi="Times New Roman" w:cs="Times New Roman"/>
+          <w:sz w:val="22"/>
+          <w:szCs w:val="22"/>
+        </w:rPr>
+        <w:t xml:space="preserve"> object for each policy</w:t>
+      </w:r>
+      <w:r>
+        <w:rPr>
+          <w:rFonts w:ascii="Times New Roman" w:hAnsi="Times New Roman" w:cs="Times New Roman"/>
+          <w:sz w:val="22"/>
+          <w:szCs w:val="22"/>
+        </w:rPr>
+        <w:t>.</w:t>
+      </w:r>
+    </w:p>
+    <w:p>
+      <w:pPr>
+        <w:pStyle w:val="ListParagraph"/>
+        <w:numPr>
+          <w:ilvl w:val="0"/>
+          <w:numId w:val="2"/>
+        </w:numPr>
+        <w:rPr>
+          <w:rFonts w:ascii="Times New Roman" w:hAnsi="Times New Roman" w:cs="Times New Roman"/>
+          <w:sz w:val="22"/>
+          <w:szCs w:val="22"/>
+        </w:rPr>
+      </w:pPr>
+      <w:r>
+        <w:rPr>
+          <w:rFonts w:ascii="Times New Roman" w:hAnsi="Times New Roman" w:cs="Times New Roman"/>
+          <w:sz w:val="22"/>
+          <w:szCs w:val="22"/>
+        </w:rPr>
+        <w:t>Run each policy</w:t>
+      </w:r>
+      <w:r>
+        <w:rPr>
+          <w:rFonts w:ascii="Times New Roman" w:hAnsi="Times New Roman" w:cs="Times New Roman"/>
+          <w:sz w:val="22"/>
+          <w:szCs w:val="22"/>
+        </w:rPr>
+        <w:t xml:space="preserve"> using the given random number seed</w:t>
+      </w:r>
+      <w:r>
+        <w:rPr>
+          <w:rFonts w:ascii="Times New Roman" w:hAnsi="Times New Roman" w:cs="Times New Roman"/>
+          <w:sz w:val="22"/>
+          <w:szCs w:val="22"/>
+        </w:rPr>
+        <w:t>,</w:t>
+      </w:r>
+      <w:r>
+        <w:rPr>
+          <w:rFonts w:ascii="Times New Roman" w:hAnsi="Times New Roman" w:cs="Times New Roman"/>
+          <w:sz w:val="22"/>
+          <w:szCs w:val="22"/>
+        </w:rPr>
+        <w:t xml:space="preserve"> </w:t>
+      </w:r>
+      <w:r>
+        <w:rPr>
+          <w:rFonts w:ascii="Times New Roman" w:hAnsi="Times New Roman" w:cs="Times New Roman"/>
+          <w:sz w:val="22"/>
+          <w:szCs w:val="22"/>
+        </w:rPr>
+        <w:t>for the number of</w:t>
+      </w:r>
+      <w:r>
+        <w:rPr>
+          <w:rFonts w:ascii="Times New Roman" w:hAnsi="Times New Roman" w:cs="Times New Roman"/>
+          <w:sz w:val="22"/>
+          <w:szCs w:val="22"/>
+        </w:rPr>
+        <w:t xml:space="preserve"> requests</w:t>
+      </w:r>
+      <w:r>
+        <w:rPr>
+          <w:rFonts w:ascii="Times New Roman" w:hAnsi="Times New Roman" w:cs="Times New Roman"/>
+          <w:sz w:val="22"/>
+          <w:szCs w:val="22"/>
+        </w:rPr>
+        <w:t xml:space="preserve"> specified on the command line</w:t>
+      </w:r>
+      <w:r>
+        <w:rPr>
+          <w:rFonts w:ascii="Times New Roman" w:hAnsi="Times New Roman" w:cs="Times New Roman"/>
+          <w:sz w:val="22"/>
+          <w:szCs w:val="22"/>
+        </w:rPr>
+        <w:t xml:space="preserve">, </w:t>
+      </w:r>
+      <w:r>
+        <w:rPr>
+          <w:rFonts w:ascii="Times New Roman" w:hAnsi="Times New Roman" w:cs="Times New Roman"/>
+          <w:sz w:val="22"/>
+          <w:szCs w:val="22"/>
+        </w:rPr>
+        <w:t xml:space="preserve">with intermixed </w:t>
+      </w:r>
+      <w:r>
+        <w:rPr>
+          <w:rFonts w:ascii="Times New Roman" w:hAnsi="Times New Roman" w:cs="Times New Roman"/>
+          <w:sz w:val="22"/>
+          <w:szCs w:val="22"/>
+        </w:rPr>
+        <w:t>allocation and deallocation</w:t>
+      </w:r>
+      <w:r>
+        <w:rPr>
+          <w:rFonts w:ascii="Times New Roman" w:hAnsi="Times New Roman" w:cs="Times New Roman"/>
+          <w:sz w:val="22"/>
+          <w:szCs w:val="22"/>
+        </w:rPr>
+        <w:t xml:space="preserve"> requests</w:t>
       </w:r>
     </w:p>
     <w:p>
@@ -1308,7 +2682,7 @@
           <w:sz w:val="22"/>
           <w:szCs w:val="22"/>
         </w:rPr>
-        <w:t>Private member variables:</w:t>
+        <w:t>With the mix given on the command line, perform allocation and deallocation requests</w:t>
       </w:r>
     </w:p>
     <w:p>
@@ -1330,15 +2704,167 @@
           <w:sz w:val="22"/>
           <w:szCs w:val="22"/>
         </w:rPr>
-        <w:t xml:space="preserve">unsigned int </w:t>
-      </w:r>
-      <w:r>
-        <w:rPr>
-          <w:rFonts w:ascii="Times New Roman" w:hAnsi="Times New Roman" w:cs="Times New Roman"/>
-          <w:sz w:val="22"/>
-          <w:szCs w:val="22"/>
-        </w:rPr>
-        <w:t>*a; the array to hold the list contents</w:t>
+        <w:lastRenderedPageBreak/>
+        <w:t>Within a loop over the operation count</w:t>
+      </w:r>
+      <w:r>
+        <w:rPr>
+          <w:rFonts w:ascii="Times New Roman" w:hAnsi="Times New Roman" w:cs="Times New Roman"/>
+          <w:sz w:val="22"/>
+          <w:szCs w:val="22"/>
+        </w:rPr>
+        <w:t xml:space="preserve"> (</w:t>
+      </w:r>
+      <w:proofErr w:type="spellStart"/>
+      <w:r>
+        <w:rPr>
+          <w:rFonts w:ascii="Times New Roman" w:hAnsi="Times New Roman" w:cs="Times New Roman"/>
+          <w:sz w:val="22"/>
+          <w:szCs w:val="22"/>
+        </w:rPr>
+        <w:t>numberOfRequests</w:t>
+      </w:r>
+      <w:proofErr w:type="spellEnd"/>
+      <w:r>
+        <w:rPr>
+          <w:rFonts w:ascii="Times New Roman" w:hAnsi="Times New Roman" w:cs="Times New Roman"/>
+          <w:sz w:val="22"/>
+          <w:szCs w:val="22"/>
+        </w:rPr>
+        <w:t>), a random number is generated between 0 and 99</w:t>
+      </w:r>
+      <w:proofErr w:type="gramStart"/>
+      <w:r>
+        <w:rPr>
+          <w:rFonts w:ascii="Times New Roman" w:hAnsi="Times New Roman" w:cs="Times New Roman"/>
+          <w:sz w:val="22"/>
+          <w:szCs w:val="22"/>
+        </w:rPr>
+        <w:t>.  If</w:t>
+      </w:r>
+      <w:proofErr w:type="gramEnd"/>
+      <w:r>
+        <w:rPr>
+          <w:rFonts w:ascii="Times New Roman" w:hAnsi="Times New Roman" w:cs="Times New Roman"/>
+          <w:sz w:val="22"/>
+          <w:szCs w:val="22"/>
+        </w:rPr>
+        <w:t xml:space="preserve"> the number is less than the </w:t>
+      </w:r>
+      <w:proofErr w:type="spellStart"/>
+      <w:r>
+        <w:rPr>
+          <w:rFonts w:ascii="Times New Roman" w:hAnsi="Times New Roman" w:cs="Times New Roman"/>
+          <w:sz w:val="22"/>
+          <w:szCs w:val="22"/>
+        </w:rPr>
+        <w:t>percentageOfAllocs</w:t>
+      </w:r>
+      <w:proofErr w:type="spellEnd"/>
+      <w:r>
+        <w:rPr>
+          <w:rFonts w:ascii="Times New Roman" w:hAnsi="Times New Roman" w:cs="Times New Roman"/>
+          <w:sz w:val="22"/>
+          <w:szCs w:val="22"/>
+        </w:rPr>
+        <w:t>, it shall do an allocation; otherwise, it will do a deallocation.</w:t>
+      </w:r>
+    </w:p>
+    <w:p>
+      <w:pPr>
+        <w:pStyle w:val="ListParagraph"/>
+        <w:numPr>
+          <w:ilvl w:val="1"/>
+          <w:numId w:val="2"/>
+        </w:numPr>
+        <w:rPr>
+          <w:rFonts w:ascii="Times New Roman" w:hAnsi="Times New Roman" w:cs="Times New Roman"/>
+          <w:sz w:val="22"/>
+          <w:szCs w:val="22"/>
+        </w:rPr>
+      </w:pPr>
+      <w:r>
+        <w:rPr>
+          <w:rFonts w:ascii="Times New Roman" w:hAnsi="Times New Roman" w:cs="Times New Roman"/>
+          <w:sz w:val="22"/>
+          <w:szCs w:val="22"/>
+        </w:rPr>
+        <w:t>Each</w:t>
+      </w:r>
+      <w:r>
+        <w:rPr>
+          <w:rFonts w:ascii="Times New Roman" w:hAnsi="Times New Roman" w:cs="Times New Roman"/>
+          <w:sz w:val="22"/>
+          <w:szCs w:val="22"/>
+        </w:rPr>
+        <w:t xml:space="preserve"> allocation request will be for a unique PID; a given PID can only do one allocation request, whether it succeeds or not.</w:t>
+      </w:r>
+      <w:r>
+        <w:rPr>
+          <w:rFonts w:ascii="Times New Roman" w:hAnsi="Times New Roman" w:cs="Times New Roman"/>
+          <w:sz w:val="22"/>
+          <w:szCs w:val="22"/>
+        </w:rPr>
+        <w:t xml:space="preserve"> The request will be for [3-10] </w:t>
+      </w:r>
+      <w:r>
+        <w:rPr>
+          <w:rFonts w:ascii="Times New Roman" w:hAnsi="Times New Roman" w:cs="Times New Roman"/>
+          <w:sz w:val="22"/>
+          <w:szCs w:val="22"/>
+        </w:rPr>
+        <w:t xml:space="preserve">memory blocks. </w:t>
+      </w:r>
+      <w:r>
+        <w:rPr>
+          <w:rFonts w:ascii="Times New Roman" w:hAnsi="Times New Roman" w:cs="Times New Roman"/>
+          <w:sz w:val="22"/>
+          <w:szCs w:val="22"/>
+        </w:rPr>
+        <w:t>For each allocation request, whether successful or not, increment a counter of allocation attempts.</w:t>
+      </w:r>
+    </w:p>
+    <w:p>
+      <w:pPr>
+        <w:pStyle w:val="ListParagraph"/>
+        <w:ind w:left="1440"/>
+        <w:rPr>
+          <w:rFonts w:ascii="Times New Roman" w:hAnsi="Times New Roman" w:cs="Times New Roman"/>
+          <w:sz w:val="22"/>
+          <w:szCs w:val="22"/>
+        </w:rPr>
+      </w:pPr>
+      <w:r>
+        <w:rPr>
+          <w:rFonts w:ascii="Times New Roman" w:hAnsi="Times New Roman" w:cs="Times New Roman"/>
+          <w:sz w:val="22"/>
+          <w:szCs w:val="22"/>
+        </w:rPr>
+        <w:t>After a successful request</w:t>
+      </w:r>
+      <w:r>
+        <w:rPr>
+          <w:rFonts w:ascii="Times New Roman" w:hAnsi="Times New Roman" w:cs="Times New Roman"/>
+          <w:sz w:val="22"/>
+          <w:szCs w:val="22"/>
+        </w:rPr>
+        <w:t xml:space="preserve">, </w:t>
+      </w:r>
+      <w:r>
+        <w:rPr>
+          <w:rFonts w:ascii="Times New Roman" w:hAnsi="Times New Roman" w:cs="Times New Roman"/>
+          <w:sz w:val="22"/>
+          <w:szCs w:val="22"/>
+        </w:rPr>
+        <w:t>the main shal</w:t>
+      </w:r>
+      <w:r>
+        <w:rPr>
+          <w:rFonts w:ascii="Times New Roman" w:hAnsi="Times New Roman" w:cs="Times New Roman"/>
+          <w:sz w:val="22"/>
+          <w:szCs w:val="22"/>
+        </w:rPr>
+        <w:t>l:</w:t>
       </w:r>
     </w:p>
     <w:p>
@@ -1360,15 +2886,204 @@
           <w:sz w:val="22"/>
           <w:szCs w:val="22"/>
         </w:rPr>
-        <w:t>unsigned int listCount, listCapacity;</w:t>
-      </w:r>
-      <w:r>
-        <w:rPr>
-          <w:rFonts w:ascii="Times New Roman" w:hAnsi="Times New Roman" w:cs="Times New Roman"/>
-          <w:sz w:val="22"/>
-          <w:szCs w:val="22"/>
-        </w:rPr>
-        <w:t xml:space="preserve"> the number of items on the list and the list’s capacity.</w:t>
+        <w:t>Add</w:t>
+      </w:r>
+      <w:r>
+        <w:rPr>
+          <w:rFonts w:ascii="Times New Roman" w:hAnsi="Times New Roman" w:cs="Times New Roman"/>
+          <w:sz w:val="22"/>
+          <w:szCs w:val="22"/>
+        </w:rPr>
+        <w:t xml:space="preserve"> the return value from </w:t>
+      </w:r>
+      <w:proofErr w:type="spellStart"/>
+      <w:proofErr w:type="gramStart"/>
+      <w:r>
+        <w:rPr>
+          <w:rFonts w:ascii="Times New Roman" w:hAnsi="Times New Roman" w:cs="Times New Roman"/>
+          <w:sz w:val="22"/>
+          <w:szCs w:val="22"/>
+        </w:rPr>
+        <w:t>allocM</w:t>
+      </w:r>
+      <w:r>
+        <w:rPr>
+          <w:rFonts w:ascii="Times New Roman" w:hAnsi="Times New Roman" w:cs="Times New Roman"/>
+          <w:sz w:val="22"/>
+          <w:szCs w:val="22"/>
+        </w:rPr>
+        <w:t>em</w:t>
+      </w:r>
+      <w:proofErr w:type="spellEnd"/>
+      <w:r>
+        <w:rPr>
+          <w:rFonts w:ascii="Times New Roman" w:hAnsi="Times New Roman" w:cs="Times New Roman"/>
+          <w:sz w:val="22"/>
+          <w:szCs w:val="22"/>
+        </w:rPr>
+        <w:t>(</w:t>
+      </w:r>
+      <w:proofErr w:type="gramEnd"/>
+      <w:r>
+        <w:rPr>
+          <w:rFonts w:ascii="Times New Roman" w:hAnsi="Times New Roman" w:cs="Times New Roman"/>
+          <w:sz w:val="22"/>
+          <w:szCs w:val="22"/>
+        </w:rPr>
+        <w:t>) to an aggregate traversal counter.</w:t>
+      </w:r>
+    </w:p>
+    <w:p>
+      <w:pPr>
+        <w:pStyle w:val="ListParagraph"/>
+        <w:numPr>
+          <w:ilvl w:val="2"/>
+          <w:numId w:val="2"/>
+        </w:numPr>
+        <w:rPr>
+          <w:rFonts w:ascii="Times New Roman" w:hAnsi="Times New Roman" w:cs="Times New Roman"/>
+          <w:sz w:val="22"/>
+          <w:szCs w:val="22"/>
+        </w:rPr>
+      </w:pPr>
+      <w:r>
+        <w:rPr>
+          <w:rFonts w:ascii="Times New Roman" w:hAnsi="Times New Roman" w:cs="Times New Roman"/>
+          <w:sz w:val="22"/>
+          <w:szCs w:val="22"/>
+        </w:rPr>
+        <w:t>C</w:t>
+      </w:r>
+      <w:r>
+        <w:rPr>
+          <w:rFonts w:ascii="Times New Roman" w:hAnsi="Times New Roman" w:cs="Times New Roman"/>
+          <w:sz w:val="22"/>
+          <w:szCs w:val="22"/>
+        </w:rPr>
+        <w:t xml:space="preserve">all the </w:t>
+      </w:r>
+      <w:proofErr w:type="spellStart"/>
+      <w:r>
+        <w:rPr>
+          <w:rFonts w:ascii="Times New Roman" w:hAnsi="Times New Roman" w:cs="Times New Roman"/>
+          <w:sz w:val="22"/>
+          <w:szCs w:val="22"/>
+        </w:rPr>
+        <w:t>memManager’s</w:t>
+      </w:r>
+      <w:proofErr w:type="spellEnd"/>
+      <w:r>
+        <w:rPr>
+          <w:rFonts w:ascii="Times New Roman" w:hAnsi="Times New Roman" w:cs="Times New Roman"/>
+          <w:sz w:val="22"/>
+          <w:szCs w:val="22"/>
+        </w:rPr>
+        <w:t xml:space="preserve"> </w:t>
+      </w:r>
+      <w:proofErr w:type="spellStart"/>
+      <w:proofErr w:type="gramStart"/>
+      <w:r>
+        <w:rPr>
+          <w:rFonts w:ascii="Times New Roman" w:hAnsi="Times New Roman" w:cs="Times New Roman"/>
+          <w:sz w:val="22"/>
+          <w:szCs w:val="22"/>
+        </w:rPr>
+        <w:t>countHoles</w:t>
+      </w:r>
+      <w:proofErr w:type="spellEnd"/>
+      <w:r>
+        <w:rPr>
+          <w:rFonts w:ascii="Times New Roman" w:hAnsi="Times New Roman" w:cs="Times New Roman"/>
+          <w:sz w:val="22"/>
+          <w:szCs w:val="22"/>
+        </w:rPr>
+        <w:t>(</w:t>
+      </w:r>
+      <w:proofErr w:type="gramEnd"/>
+      <w:r>
+        <w:rPr>
+          <w:rFonts w:ascii="Times New Roman" w:hAnsi="Times New Roman" w:cs="Times New Roman"/>
+          <w:sz w:val="22"/>
+          <w:szCs w:val="22"/>
+        </w:rPr>
+        <w:t>) function</w:t>
+      </w:r>
+      <w:r>
+        <w:rPr>
+          <w:rFonts w:ascii="Times New Roman" w:hAnsi="Times New Roman" w:cs="Times New Roman"/>
+          <w:sz w:val="22"/>
+          <w:szCs w:val="22"/>
+        </w:rPr>
+        <w:t xml:space="preserve">, </w:t>
+      </w:r>
+      <w:r>
+        <w:rPr>
+          <w:rFonts w:ascii="Times New Roman" w:hAnsi="Times New Roman" w:cs="Times New Roman"/>
+          <w:sz w:val="22"/>
+          <w:szCs w:val="22"/>
+        </w:rPr>
+        <w:t>adding</w:t>
+      </w:r>
+      <w:r>
+        <w:rPr>
+          <w:rFonts w:ascii="Times New Roman" w:hAnsi="Times New Roman" w:cs="Times New Roman"/>
+          <w:sz w:val="22"/>
+          <w:szCs w:val="22"/>
+        </w:rPr>
+        <w:t xml:space="preserve"> the response </w:t>
+      </w:r>
+      <w:r>
+        <w:rPr>
+          <w:rFonts w:ascii="Times New Roman" w:hAnsi="Times New Roman" w:cs="Times New Roman"/>
+          <w:sz w:val="22"/>
+          <w:szCs w:val="22"/>
+        </w:rPr>
+        <w:t xml:space="preserve">to an aggregate hole </w:t>
+      </w:r>
+      <w:proofErr w:type="gramStart"/>
+      <w:r>
+        <w:rPr>
+          <w:rFonts w:ascii="Times New Roman" w:hAnsi="Times New Roman" w:cs="Times New Roman"/>
+          <w:sz w:val="22"/>
+          <w:szCs w:val="22"/>
+        </w:rPr>
+        <w:t>counter.</w:t>
+      </w:r>
+      <w:r>
+        <w:rPr>
+          <w:rFonts w:ascii="Times New Roman" w:hAnsi="Times New Roman" w:cs="Times New Roman"/>
+          <w:sz w:val="22"/>
+          <w:szCs w:val="22"/>
+        </w:rPr>
+        <w:t>.</w:t>
+      </w:r>
+      <w:proofErr w:type="gramEnd"/>
+    </w:p>
+    <w:p>
+      <w:pPr>
+        <w:pStyle w:val="ListParagraph"/>
+        <w:ind w:left="1440"/>
+        <w:rPr>
+          <w:rFonts w:ascii="Times New Roman" w:hAnsi="Times New Roman" w:cs="Times New Roman"/>
+          <w:sz w:val="22"/>
+          <w:szCs w:val="22"/>
+        </w:rPr>
+      </w:pPr>
+      <w:r>
+        <w:rPr>
+          <w:rFonts w:ascii="Times New Roman" w:hAnsi="Times New Roman" w:cs="Times New Roman"/>
+          <w:sz w:val="22"/>
+          <w:szCs w:val="22"/>
+        </w:rPr>
+        <w:t xml:space="preserve">After a </w:t>
+      </w:r>
+      <w:r>
+        <w:rPr>
+          <w:rFonts w:ascii="Times New Roman" w:hAnsi="Times New Roman" w:cs="Times New Roman"/>
+          <w:sz w:val="22"/>
+          <w:szCs w:val="22"/>
+        </w:rPr>
+        <w:t>failed memory allocation, the main shall increment an aggregate failure counter.</w:t>
       </w:r>
     </w:p>
     <w:p>
@@ -1390,226 +3105,15 @@
           <w:sz w:val="22"/>
           <w:szCs w:val="22"/>
         </w:rPr>
-        <w:t>Public member functions:</w:t>
-      </w:r>
-    </w:p>
-    <w:p>
-      <w:pPr>
-        <w:pStyle w:val="ListParagraph"/>
-        <w:numPr>
-          <w:ilvl w:val="2"/>
-          <w:numId w:val="2"/>
-        </w:numPr>
-        <w:rPr>
-          <w:rFonts w:ascii="Times New Roman" w:hAnsi="Times New Roman" w:cs="Times New Roman"/>
-          <w:sz w:val="22"/>
-          <w:szCs w:val="22"/>
-        </w:rPr>
-      </w:pPr>
-      <w:r>
-        <w:rPr>
-          <w:rFonts w:ascii="Times New Roman" w:hAnsi="Times New Roman" w:cs="Times New Roman"/>
-          <w:sz w:val="22"/>
-          <w:szCs w:val="22"/>
-        </w:rPr>
-        <w:t>list(unsigned listCapacity); the constructor</w:t>
-      </w:r>
-    </w:p>
-    <w:p>
-      <w:pPr>
-        <w:pStyle w:val="ListParagraph"/>
-        <w:numPr>
-          <w:ilvl w:val="2"/>
-          <w:numId w:val="2"/>
-        </w:numPr>
-        <w:rPr>
-          <w:rFonts w:ascii="Times New Roman" w:hAnsi="Times New Roman" w:cs="Times New Roman"/>
-          <w:sz w:val="22"/>
-          <w:szCs w:val="22"/>
-        </w:rPr>
-      </w:pPr>
-      <w:r>
-        <w:rPr>
-          <w:rFonts w:ascii="Times New Roman" w:hAnsi="Times New Roman" w:cs="Times New Roman"/>
-          <w:sz w:val="22"/>
-          <w:szCs w:val="22"/>
-        </w:rPr>
-        <w:t>~list(); the destructor</w:t>
-      </w:r>
-    </w:p>
-    <w:p>
-      <w:pPr>
-        <w:pStyle w:val="ListParagraph"/>
-        <w:numPr>
-          <w:ilvl w:val="2"/>
-          <w:numId w:val="2"/>
-        </w:numPr>
-        <w:rPr>
-          <w:rFonts w:ascii="Times New Roman" w:hAnsi="Times New Roman" w:cs="Times New Roman"/>
-          <w:sz w:val="22"/>
-          <w:szCs w:val="22"/>
-        </w:rPr>
-      </w:pPr>
-      <w:r>
-        <w:rPr>
-          <w:rFonts w:ascii="Times New Roman" w:hAnsi="Times New Roman" w:cs="Times New Roman"/>
-          <w:sz w:val="22"/>
-          <w:szCs w:val="22"/>
-        </w:rPr>
-        <w:t xml:space="preserve">bool add(int </w:t>
-      </w:r>
-      <w:r>
-        <w:rPr>
-          <w:rFonts w:ascii="Times New Roman" w:hAnsi="Times New Roman" w:cs="Times New Roman"/>
-          <w:sz w:val="22"/>
-          <w:szCs w:val="22"/>
-        </w:rPr>
-        <w:t>val); adds val to the end of the list in constant time; returns true if the list has capacity to do the addition, false otherwise.</w:t>
-      </w:r>
-    </w:p>
-    <w:p>
-      <w:pPr>
-        <w:pStyle w:val="ListParagraph"/>
-        <w:numPr>
-          <w:ilvl w:val="2"/>
-          <w:numId w:val="2"/>
-        </w:numPr>
-        <w:rPr>
-          <w:rFonts w:ascii="Times New Roman" w:hAnsi="Times New Roman" w:cs="Times New Roman"/>
-          <w:sz w:val="22"/>
-          <w:szCs w:val="22"/>
-        </w:rPr>
-      </w:pPr>
-      <w:r>
-        <w:rPr>
-          <w:rFonts w:ascii="Times New Roman" w:hAnsi="Times New Roman" w:cs="Times New Roman"/>
-          <w:sz w:val="22"/>
-          <w:szCs w:val="22"/>
-        </w:rPr>
-        <w:t xml:space="preserve">bool deleteAt(unsigned int index); </w:t>
-      </w:r>
-      <w:r>
-        <w:rPr>
-          <w:rFonts w:ascii="Times New Roman" w:hAnsi="Times New Roman" w:cs="Times New Roman"/>
-          <w:sz w:val="22"/>
-          <w:szCs w:val="22"/>
-        </w:rPr>
-        <w:t xml:space="preserve">if the index is valid, it </w:t>
-      </w:r>
-      <w:r>
-        <w:rPr>
-          <w:rFonts w:ascii="Times New Roman" w:hAnsi="Times New Roman" w:cs="Times New Roman"/>
-          <w:sz w:val="22"/>
-          <w:szCs w:val="22"/>
-        </w:rPr>
-        <w:t xml:space="preserve">deletes the </w:t>
-      </w:r>
-      <w:r>
-        <w:rPr>
-          <w:rFonts w:ascii="Times New Roman" w:hAnsi="Times New Roman" w:cs="Times New Roman"/>
-          <w:sz w:val="22"/>
-          <w:szCs w:val="22"/>
-        </w:rPr>
-        <w:t>list entry specified by index, replacing that entry with what’s currently at the end of the list, and returns true. Oherwise returns false.</w:t>
-      </w:r>
-    </w:p>
-    <w:p>
-      <w:pPr>
-        <w:pStyle w:val="ListParagraph"/>
-        <w:numPr>
-          <w:ilvl w:val="2"/>
-          <w:numId w:val="2"/>
-        </w:numPr>
-        <w:rPr>
-          <w:rFonts w:ascii="Times New Roman" w:hAnsi="Times New Roman" w:cs="Times New Roman"/>
-          <w:sz w:val="22"/>
-          <w:szCs w:val="22"/>
-        </w:rPr>
-      </w:pPr>
-      <w:r>
-        <w:rPr>
-          <w:rFonts w:ascii="Times New Roman" w:hAnsi="Times New Roman" w:cs="Times New Roman"/>
-          <w:sz w:val="22"/>
-          <w:szCs w:val="22"/>
-        </w:rPr>
-        <w:t xml:space="preserve">int readAt(unsigned int index) const; returns the value </w:t>
-      </w:r>
-      <w:r>
-        <w:rPr>
-          <w:rFonts w:ascii="Times New Roman" w:hAnsi="Times New Roman" w:cs="Times New Roman"/>
-          <w:sz w:val="22"/>
-          <w:szCs w:val="22"/>
-        </w:rPr>
-        <w:t xml:space="preserve">at that index, if index is valid, otherwise </w:t>
-      </w:r>
-      <w:r>
-        <w:rPr>
-          <w:rFonts w:ascii="Times New Roman" w:hAnsi="Times New Roman" w:cs="Times New Roman"/>
-          <w:sz w:val="22"/>
-          <w:szCs w:val="22"/>
-        </w:rPr>
-        <w:t>returns -1.</w:t>
-      </w:r>
-    </w:p>
-    <w:p>
-      <w:pPr>
-        <w:pStyle w:val="ListParagraph"/>
-        <w:numPr>
-          <w:ilvl w:val="2"/>
-          <w:numId w:val="2"/>
-        </w:numPr>
-        <w:rPr>
-          <w:rFonts w:ascii="Times New Roman" w:hAnsi="Times New Roman" w:cs="Times New Roman"/>
-          <w:sz w:val="22"/>
-          <w:szCs w:val="22"/>
-        </w:rPr>
-      </w:pPr>
-      <w:r>
-        <w:rPr>
-          <w:rFonts w:ascii="Times New Roman" w:hAnsi="Times New Roman" w:cs="Times New Roman"/>
-          <w:sz w:val="22"/>
-          <w:szCs w:val="22"/>
-        </w:rPr>
-        <w:t>void printIt() const; prints the list, one entry per line; used only for debugging, and not for the final submission.</w:t>
-      </w:r>
-    </w:p>
-    <w:p>
-      <w:pPr>
-        <w:pStyle w:val="ListParagraph"/>
-        <w:numPr>
-          <w:ilvl w:val="2"/>
-          <w:numId w:val="2"/>
-        </w:numPr>
-        <w:rPr>
-          <w:rFonts w:ascii="Times New Roman" w:hAnsi="Times New Roman" w:cs="Times New Roman"/>
-          <w:sz w:val="22"/>
-          <w:szCs w:val="22"/>
-        </w:rPr>
-      </w:pPr>
-      <w:r>
-        <w:rPr>
-          <w:rFonts w:ascii="Times New Roman" w:hAnsi="Times New Roman" w:cs="Times New Roman"/>
-          <w:sz w:val="22"/>
-          <w:szCs w:val="22"/>
-        </w:rPr>
-        <w:t>unsigned getCount(); returns listCount.</w:t>
-      </w:r>
-    </w:p>
-    <w:p>
-      <w:pPr>
-        <w:rPr>
-          <w:rFonts w:ascii="Times New Roman" w:hAnsi="Times New Roman" w:cs="Times New Roman"/>
-          <w:sz w:val="22"/>
-          <w:szCs w:val="22"/>
-        </w:rPr>
-      </w:pPr>
-      <w:r>
-        <w:rPr>
-          <w:rFonts w:ascii="Times New Roman" w:hAnsi="Times New Roman" w:cs="Times New Roman"/>
-          <w:sz w:val="22"/>
-          <w:szCs w:val="22"/>
-        </w:rPr>
-        <w:t>The main program shall:</w:t>
+        <w:t>Each deallocation request is for a PID that has allocated memory</w:t>
+      </w:r>
+      <w:r>
+        <w:rPr>
+          <w:rFonts w:ascii="Times New Roman" w:hAnsi="Times New Roman" w:cs="Times New Roman"/>
+          <w:sz w:val="22"/>
+          <w:szCs w:val="22"/>
+        </w:rPr>
+        <w:t>, with the PID chosen at random.</w:t>
       </w:r>
     </w:p>
     <w:p>
@@ -1631,45 +3135,222 @@
           <w:sz w:val="22"/>
           <w:szCs w:val="22"/>
         </w:rPr>
-        <w:t>Ca</w:t>
-      </w:r>
-      <w:r>
-        <w:rPr>
-          <w:rFonts w:ascii="Times New Roman" w:hAnsi="Times New Roman" w:cs="Times New Roman"/>
-          <w:sz w:val="22"/>
-          <w:szCs w:val="22"/>
-        </w:rPr>
-        <w:t>pture the program arguments from the command line, which shall be of the form:</w:t>
-      </w:r>
-    </w:p>
-    <w:p>
-      <w:pPr>
-        <w:pStyle w:val="ListParagraph"/>
-        <w:ind w:left="1440"/>
+        <w:t>Prints the following statistics for each policy:</w:t>
+      </w:r>
+    </w:p>
+    <w:p>
+      <w:pPr>
+        <w:pStyle w:val="ListParagraph"/>
+        <w:numPr>
+          <w:ilvl w:val="1"/>
+          <w:numId w:val="2"/>
+        </w:numPr>
+        <w:rPr>
+          <w:rFonts w:ascii="Times New Roman" w:hAnsi="Times New Roman" w:cs="Times New Roman"/>
+          <w:sz w:val="22"/>
+          <w:szCs w:val="22"/>
+        </w:rPr>
+      </w:pPr>
+      <w:r>
+        <w:rPr>
+          <w:rFonts w:ascii="Times New Roman" w:hAnsi="Times New Roman" w:cs="Times New Roman"/>
+          <w:sz w:val="22"/>
+          <w:szCs w:val="22"/>
+        </w:rPr>
+        <w:t>Print the average of the hole counts, which will be the aggregate hole counter divided by the number of successful allocations.</w:t>
+      </w:r>
+    </w:p>
+    <w:p>
+      <w:pPr>
+        <w:pStyle w:val="ListParagraph"/>
+        <w:numPr>
+          <w:ilvl w:val="1"/>
+          <w:numId w:val="2"/>
+        </w:numPr>
+        <w:rPr>
+          <w:rFonts w:ascii="Times New Roman" w:hAnsi="Times New Roman" w:cs="Times New Roman"/>
+          <w:sz w:val="22"/>
+          <w:szCs w:val="22"/>
+        </w:rPr>
+      </w:pPr>
+      <w:r>
+        <w:rPr>
+          <w:rFonts w:ascii="Times New Roman" w:hAnsi="Times New Roman" w:cs="Times New Roman"/>
+          <w:sz w:val="22"/>
+          <w:szCs w:val="22"/>
+        </w:rPr>
+        <w:t xml:space="preserve">Print the </w:t>
+      </w:r>
+      <w:r>
+        <w:rPr>
+          <w:rFonts w:ascii="Times New Roman" w:hAnsi="Times New Roman" w:cs="Times New Roman"/>
+          <w:sz w:val="22"/>
+          <w:szCs w:val="22"/>
+        </w:rPr>
+        <w:t>average number of traversals, which will be the aggregate traversal counter divided by the number of successful allocations.</w:t>
+      </w:r>
+    </w:p>
+    <w:p>
+      <w:pPr>
+        <w:pStyle w:val="ListParagraph"/>
+        <w:numPr>
+          <w:ilvl w:val="1"/>
+          <w:numId w:val="2"/>
+        </w:numPr>
+        <w:rPr>
+          <w:rFonts w:ascii="Times New Roman" w:hAnsi="Times New Roman" w:cs="Times New Roman"/>
+          <w:sz w:val="22"/>
+          <w:szCs w:val="22"/>
+        </w:rPr>
+      </w:pPr>
+      <w:r>
+        <w:rPr>
+          <w:rFonts w:ascii="Times New Roman" w:hAnsi="Times New Roman" w:cs="Times New Roman"/>
+          <w:sz w:val="22"/>
+          <w:szCs w:val="22"/>
+        </w:rPr>
+        <w:t xml:space="preserve">Print the percentage of </w:t>
+      </w:r>
+      <w:r>
+        <w:rPr>
+          <w:rFonts w:ascii="Times New Roman" w:hAnsi="Times New Roman" w:cs="Times New Roman"/>
+          <w:sz w:val="22"/>
+          <w:szCs w:val="22"/>
+        </w:rPr>
+        <w:t xml:space="preserve">denials, which will be the aggregate </w:t>
+      </w:r>
+      <w:r>
+        <w:rPr>
+          <w:rFonts w:ascii="Times New Roman" w:hAnsi="Times New Roman" w:cs="Times New Roman"/>
+          <w:sz w:val="22"/>
+          <w:szCs w:val="22"/>
+        </w:rPr>
+        <w:t>failed allocation attempts divided by the total number of allocation attempts.</w:t>
+      </w:r>
+    </w:p>
+    <w:p>
+      <w:pPr>
+        <w:rPr>
+          <w:rFonts w:ascii="Times New Roman" w:hAnsi="Times New Roman" w:cs="Times New Roman"/>
+          <w:sz w:val="22"/>
+          <w:szCs w:val="22"/>
+        </w:rPr>
+      </w:pPr>
+      <w:r>
+        <w:rPr>
+          <w:rFonts w:ascii="Times New Roman" w:hAnsi="Times New Roman" w:cs="Times New Roman"/>
+          <w:sz w:val="22"/>
+          <w:szCs w:val="22"/>
+        </w:rPr>
+        <w:t>There are three performance parameters that your simulation should calculate for all four techniques: average number of external fragments, average allocation time in terms of the average number of nodes traversed in allocation, and the percentage of times an allocation request is denied.</w:t>
+      </w:r>
+    </w:p>
+    <w:p>
+      <w:pPr>
+        <w:rPr>
+          <w:rFonts w:ascii="Times New Roman" w:hAnsi="Times New Roman" w:cs="Times New Roman"/>
+          <w:sz w:val="22"/>
+          <w:szCs w:val="22"/>
+        </w:rPr>
+      </w:pPr>
+      <w:r>
+        <w:rPr>
+          <w:rFonts w:ascii="Times New Roman" w:hAnsi="Times New Roman" w:cs="Times New Roman"/>
+          <w:sz w:val="22"/>
+          <w:szCs w:val="22"/>
+        </w:rPr>
+        <w:t xml:space="preserve">The program shall consist of the following files: </w:t>
+      </w:r>
+      <w:proofErr w:type="spellStart"/>
+      <w:r>
+        <w:rPr>
+          <w:rFonts w:ascii="Times New Roman" w:hAnsi="Times New Roman" w:cs="Times New Roman"/>
+          <w:sz w:val="22"/>
+          <w:szCs w:val="22"/>
+        </w:rPr>
+        <w:t>Makefile</w:t>
+      </w:r>
+      <w:proofErr w:type="spellEnd"/>
+      <w:r>
+        <w:rPr>
+          <w:rFonts w:ascii="Times New Roman" w:hAnsi="Times New Roman" w:cs="Times New Roman"/>
+          <w:sz w:val="22"/>
+          <w:szCs w:val="22"/>
+        </w:rPr>
+        <w:t xml:space="preserve">, </w:t>
+      </w:r>
+      <w:proofErr w:type="spellStart"/>
+      <w:r>
+        <w:rPr>
+          <w:rFonts w:ascii="Times New Roman" w:hAnsi="Times New Roman" w:cs="Times New Roman"/>
+          <w:sz w:val="22"/>
+          <w:szCs w:val="22"/>
+        </w:rPr>
+        <w:t>memSim.h</w:t>
+      </w:r>
+      <w:proofErr w:type="spellEnd"/>
+      <w:r>
+        <w:rPr>
+          <w:rFonts w:ascii="Times New Roman" w:hAnsi="Times New Roman" w:cs="Times New Roman"/>
+          <w:sz w:val="22"/>
+          <w:szCs w:val="22"/>
+        </w:rPr>
+        <w:t xml:space="preserve"> memSim.cpp, mimSimMain.cpp.</w:t>
+      </w:r>
+    </w:p>
+    <w:p>
+      <w:pPr>
+        <w:rPr>
+          <w:rFonts w:ascii="Times New Roman" w:hAnsi="Times New Roman" w:cs="Times New Roman"/>
+          <w:sz w:val="22"/>
+          <w:szCs w:val="22"/>
+        </w:rPr>
+      </w:pPr>
+      <w:r>
+        <w:rPr>
+          <w:rFonts w:ascii="Times New Roman" w:hAnsi="Times New Roman" w:cs="Times New Roman"/>
+          <w:sz w:val="22"/>
+          <w:szCs w:val="22"/>
+        </w:rPr>
+        <w:t xml:space="preserve">For the final submission, the program shall be run with the following sets of parameters, with the output being captured in </w:t>
+      </w:r>
+      <w:r>
+        <w:rPr>
+          <w:rFonts w:ascii="Times New Roman" w:hAnsi="Times New Roman" w:cs="Times New Roman"/>
+          <w:sz w:val="22"/>
+          <w:szCs w:val="22"/>
+        </w:rPr>
+        <w:t>output.txt:</w:t>
+      </w:r>
+    </w:p>
+    <w:p>
+      <w:pPr>
         <w:rPr>
           <w:rFonts w:ascii="Courier New" w:hAnsi="Courier New" w:cs="Courier New"/>
           <w:sz w:val="22"/>
           <w:szCs w:val="22"/>
         </w:rPr>
       </w:pPr>
+      <w:proofErr w:type="gramStart"/>
       <w:r>
         <w:rPr>
           <w:rFonts w:ascii="Courier New" w:hAnsi="Courier New" w:cs="Courier New"/>
           <w:sz w:val="22"/>
           <w:szCs w:val="22"/>
         </w:rPr>
-        <w:t xml:space="preserve">memSim </w:t>
-      </w:r>
+        <w:t>./</w:t>
+      </w:r>
+      <w:proofErr w:type="spellStart"/>
+      <w:proofErr w:type="gramEnd"/>
       <w:r>
         <w:rPr>
           <w:rFonts w:ascii="Courier New" w:hAnsi="Courier New" w:cs="Courier New"/>
-          <w:b/>
-          <w:bCs/>
-          <w:sz w:val="22"/>
-          <w:szCs w:val="22"/>
-        </w:rPr>
-        <w:t>numberOfRequests</w:t>
-      </w:r>
+          <w:sz w:val="22"/>
+          <w:szCs w:val="22"/>
+        </w:rPr>
+        <w:t>memSim</w:t>
+      </w:r>
+      <w:proofErr w:type="spellEnd"/>
       <w:r>
         <w:rPr>
           <w:rFonts w:ascii="Courier New" w:hAnsi="Courier New" w:cs="Courier New"/>
@@ -1681,12 +3362,10 @@
       <w:r>
         <w:rPr>
           <w:rFonts w:ascii="Courier New" w:hAnsi="Courier New" w:cs="Courier New"/>
-          <w:b/>
-          <w:bCs/>
-          <w:sz w:val="22"/>
-          <w:szCs w:val="22"/>
-        </w:rPr>
-        <w:t>percentageOfAllocs</w:t>
+          <w:sz w:val="22"/>
+          <w:szCs w:val="22"/>
+        </w:rPr>
+        <w:t xml:space="preserve">10000 50 1 &gt; </w:t>
       </w:r>
       <w:r>
         <w:rPr>
@@ -1694,17 +3373,147 @@
           <w:sz w:val="22"/>
           <w:szCs w:val="22"/>
         </w:rPr>
-        <w:t xml:space="preserve"> </w:t>
-      </w:r>
-      <w:r>
+        <w:t>output.txt</w:t>
+      </w:r>
+    </w:p>
+    <w:p>
+      <w:pPr>
         <w:rPr>
           <w:rFonts w:ascii="Courier New" w:hAnsi="Courier New" w:cs="Courier New"/>
-          <w:b/>
-          <w:bCs/>
-          <w:sz w:val="22"/>
-          <w:szCs w:val="22"/>
-        </w:rPr>
-        <w:t>randomSeed</w:t>
+          <w:sz w:val="22"/>
+          <w:szCs w:val="22"/>
+        </w:rPr>
+      </w:pPr>
+      <w:proofErr w:type="gramStart"/>
+      <w:r>
+        <w:rPr>
+          <w:rFonts w:ascii="Courier New" w:hAnsi="Courier New" w:cs="Courier New"/>
+          <w:sz w:val="22"/>
+          <w:szCs w:val="22"/>
+        </w:rPr>
+        <w:t>./</w:t>
+      </w:r>
+      <w:proofErr w:type="spellStart"/>
+      <w:proofErr w:type="gramEnd"/>
+      <w:r>
+        <w:rPr>
+          <w:rFonts w:ascii="Courier New" w:hAnsi="Courier New" w:cs="Courier New"/>
+          <w:sz w:val="22"/>
+          <w:szCs w:val="22"/>
+        </w:rPr>
+        <w:t>memSim</w:t>
+      </w:r>
+      <w:proofErr w:type="spellEnd"/>
+      <w:r>
+        <w:rPr>
+          <w:rFonts w:ascii="Courier New" w:hAnsi="Courier New" w:cs="Courier New"/>
+          <w:sz w:val="22"/>
+          <w:szCs w:val="22"/>
+        </w:rPr>
+        <w:t xml:space="preserve"> 10000 70 </w:t>
+      </w:r>
+      <w:r>
+        <w:rPr>
+          <w:rFonts w:ascii="Courier New" w:hAnsi="Courier New" w:cs="Courier New"/>
+          <w:sz w:val="22"/>
+          <w:szCs w:val="22"/>
+        </w:rPr>
+        <w:t>1 &gt;&gt; output.txt</w:t>
+      </w:r>
+    </w:p>
+    <w:p>
+      <w:pPr>
+        <w:rPr>
+          <w:rFonts w:ascii="Courier New" w:hAnsi="Courier New" w:cs="Courier New"/>
+          <w:sz w:val="22"/>
+          <w:szCs w:val="22"/>
+        </w:rPr>
+      </w:pPr>
+      <w:proofErr w:type="gramStart"/>
+      <w:r>
+        <w:rPr>
+          <w:rFonts w:ascii="Courier New" w:hAnsi="Courier New" w:cs="Courier New"/>
+          <w:sz w:val="22"/>
+          <w:szCs w:val="22"/>
+        </w:rPr>
+        <w:t>./</w:t>
+      </w:r>
+      <w:proofErr w:type="spellStart"/>
+      <w:proofErr w:type="gramEnd"/>
+      <w:r>
+        <w:rPr>
+          <w:rFonts w:ascii="Courier New" w:hAnsi="Courier New" w:cs="Courier New"/>
+          <w:sz w:val="22"/>
+          <w:szCs w:val="22"/>
+        </w:rPr>
+        <w:t>memSim</w:t>
+      </w:r>
+      <w:proofErr w:type="spellEnd"/>
+      <w:r>
+        <w:rPr>
+          <w:rFonts w:ascii="Courier New" w:hAnsi="Courier New" w:cs="Courier New"/>
+          <w:sz w:val="22"/>
+          <w:szCs w:val="22"/>
+        </w:rPr>
+        <w:t xml:space="preserve"> 10000 85 1 &gt;&gt; output.txt</w:t>
+      </w:r>
+    </w:p>
+    <w:p>
+      <w:pPr>
+        <w:rPr>
+          <w:rFonts w:ascii="Courier New" w:hAnsi="Courier New" w:cs="Courier New"/>
+          <w:sz w:val="22"/>
+          <w:szCs w:val="22"/>
+        </w:rPr>
+      </w:pPr>
+    </w:p>
+    <w:p>
+      <w:pPr>
+        <w:rPr>
+          <w:rFonts w:ascii="Courier New" w:hAnsi="Courier New" w:cs="Courier New"/>
+          <w:sz w:val="22"/>
+          <w:szCs w:val="22"/>
+        </w:rPr>
+      </w:pPr>
+      <w:r>
+        <w:rPr>
+          <w:rFonts w:ascii="Courier New" w:hAnsi="Courier New" w:cs="Courier New"/>
+          <w:sz w:val="22"/>
+          <w:szCs w:val="22"/>
+        </w:rPr>
+        <w:t xml:space="preserve">Your </w:t>
+      </w:r>
+      <w:r>
+        <w:rPr>
+          <w:rFonts w:ascii="Courier New" w:hAnsi="Courier New" w:cs="Courier New"/>
+          <w:sz w:val="22"/>
+          <w:szCs w:val="22"/>
+        </w:rPr>
+        <w:t xml:space="preserve">D2L </w:t>
+      </w:r>
+      <w:r>
+        <w:rPr>
+          <w:rFonts w:ascii="Courier New" w:hAnsi="Courier New" w:cs="Courier New"/>
+          <w:sz w:val="22"/>
+          <w:szCs w:val="22"/>
+        </w:rPr>
+        <w:t xml:space="preserve">submission shall include </w:t>
+      </w:r>
+      <w:r>
+        <w:rPr>
+          <w:rFonts w:ascii="Courier New" w:hAnsi="Courier New" w:cs="Courier New"/>
+          <w:sz w:val="22"/>
+          <w:szCs w:val="22"/>
+        </w:rPr>
+        <w:t xml:space="preserve">a zip file containing </w:t>
+      </w:r>
+      <w:r>
+        <w:rPr>
+          <w:rFonts w:ascii="Courier New" w:hAnsi="Courier New" w:cs="Courier New"/>
+          <w:sz w:val="22"/>
+          <w:szCs w:val="22"/>
+        </w:rPr>
+        <w:t>the following:</w:t>
       </w:r>
     </w:p>
     <w:p>
@@ -1715,26 +3524,18 @@
           <w:numId w:val="2"/>
         </w:numPr>
         <w:rPr>
-          <w:rFonts w:ascii="Times New Roman" w:hAnsi="Times New Roman" w:cs="Times New Roman"/>
-          <w:sz w:val="22"/>
-          <w:szCs w:val="22"/>
-        </w:rPr>
-      </w:pPr>
-      <w:r>
-        <w:rPr>
-          <w:rFonts w:ascii="Times New Roman" w:hAnsi="Times New Roman" w:cs="Times New Roman"/>
-          <w:sz w:val="22"/>
-          <w:szCs w:val="22"/>
-        </w:rPr>
-        <w:t>Instantiate a memManager object for each policy</w:t>
-      </w:r>
-      <w:r>
-        <w:rPr>
-          <w:rFonts w:ascii="Times New Roman" w:hAnsi="Times New Roman" w:cs="Times New Roman"/>
-          <w:sz w:val="22"/>
-          <w:szCs w:val="22"/>
-        </w:rPr>
-        <w:t>.</w:t>
+          <w:rFonts w:ascii="Courier New" w:hAnsi="Courier New" w:cs="Courier New"/>
+          <w:sz w:val="22"/>
+          <w:szCs w:val="22"/>
+        </w:rPr>
+      </w:pPr>
+      <w:r>
+        <w:rPr>
+          <w:rFonts w:ascii="Courier New" w:hAnsi="Courier New" w:cs="Courier New"/>
+          <w:sz w:val="22"/>
+          <w:szCs w:val="22"/>
+        </w:rPr>
+        <w:t>Your source files</w:t>
       </w:r>
     </w:p>
     <w:p>
@@ -1745,392 +3546,29 @@
           <w:numId w:val="2"/>
         </w:numPr>
         <w:rPr>
-          <w:rFonts w:ascii="Times New Roman" w:hAnsi="Times New Roman" w:cs="Times New Roman"/>
-          <w:sz w:val="22"/>
-          <w:szCs w:val="22"/>
-        </w:rPr>
-      </w:pPr>
-      <w:r>
-        <w:rPr>
-          <w:rFonts w:ascii="Times New Roman" w:hAnsi="Times New Roman" w:cs="Times New Roman"/>
-          <w:sz w:val="22"/>
-          <w:szCs w:val="22"/>
-        </w:rPr>
-        <w:t>Run each policy</w:t>
-      </w:r>
-      <w:r>
-        <w:rPr>
-          <w:rFonts w:ascii="Times New Roman" w:hAnsi="Times New Roman" w:cs="Times New Roman"/>
-          <w:sz w:val="22"/>
-          <w:szCs w:val="22"/>
-        </w:rPr>
-        <w:t xml:space="preserve"> using the given random number seed</w:t>
-      </w:r>
-      <w:r>
-        <w:rPr>
-          <w:rFonts w:ascii="Times New Roman" w:hAnsi="Times New Roman" w:cs="Times New Roman"/>
-          <w:sz w:val="22"/>
-          <w:szCs w:val="22"/>
-        </w:rPr>
-        <w:t>,</w:t>
-      </w:r>
-      <w:r>
-        <w:rPr>
-          <w:rFonts w:ascii="Times New Roman" w:hAnsi="Times New Roman" w:cs="Times New Roman"/>
-          <w:sz w:val="22"/>
-          <w:szCs w:val="22"/>
-        </w:rPr>
-        <w:t xml:space="preserve"> </w:t>
-      </w:r>
-      <w:r>
-        <w:rPr>
-          <w:rFonts w:ascii="Times New Roman" w:hAnsi="Times New Roman" w:cs="Times New Roman"/>
-          <w:sz w:val="22"/>
-          <w:szCs w:val="22"/>
-        </w:rPr>
-        <w:t>for the number of</w:t>
-      </w:r>
-      <w:r>
-        <w:rPr>
-          <w:rFonts w:ascii="Times New Roman" w:hAnsi="Times New Roman" w:cs="Times New Roman"/>
-          <w:sz w:val="22"/>
-          <w:szCs w:val="22"/>
-        </w:rPr>
-        <w:t xml:space="preserve"> requests</w:t>
-      </w:r>
-      <w:r>
-        <w:rPr>
-          <w:rFonts w:ascii="Times New Roman" w:hAnsi="Times New Roman" w:cs="Times New Roman"/>
-          <w:sz w:val="22"/>
-          <w:szCs w:val="22"/>
-        </w:rPr>
-        <w:t xml:space="preserve"> specified on the command line</w:t>
-      </w:r>
-      <w:r>
-        <w:rPr>
-          <w:rFonts w:ascii="Times New Roman" w:hAnsi="Times New Roman" w:cs="Times New Roman"/>
-          <w:sz w:val="22"/>
-          <w:szCs w:val="22"/>
-        </w:rPr>
-        <w:t xml:space="preserve">, </w:t>
-      </w:r>
-      <w:r>
-        <w:rPr>
-          <w:rFonts w:ascii="Times New Roman" w:hAnsi="Times New Roman" w:cs="Times New Roman"/>
-          <w:sz w:val="22"/>
-          <w:szCs w:val="22"/>
-        </w:rPr>
-        <w:t xml:space="preserve">with intermixed </w:t>
-      </w:r>
-      <w:r>
-        <w:rPr>
-          <w:rFonts w:ascii="Times New Roman" w:hAnsi="Times New Roman" w:cs="Times New Roman"/>
-          <w:sz w:val="22"/>
-          <w:szCs w:val="22"/>
-        </w:rPr>
-        <w:t>allocation and deallocation</w:t>
-      </w:r>
-      <w:r>
-        <w:rPr>
-          <w:rFonts w:ascii="Times New Roman" w:hAnsi="Times New Roman" w:cs="Times New Roman"/>
-          <w:sz w:val="22"/>
-          <w:szCs w:val="22"/>
-        </w:rPr>
-        <w:t xml:space="preserve"> requests</w:t>
-      </w:r>
-    </w:p>
-    <w:p>
-      <w:pPr>
-        <w:pStyle w:val="ListParagraph"/>
-        <w:numPr>
-          <w:ilvl w:val="1"/>
-          <w:numId w:val="2"/>
-        </w:numPr>
-        <w:rPr>
-          <w:rFonts w:ascii="Times New Roman" w:hAnsi="Times New Roman" w:cs="Times New Roman"/>
-          <w:sz w:val="22"/>
-          <w:szCs w:val="22"/>
-        </w:rPr>
-      </w:pPr>
-      <w:r>
-        <w:rPr>
-          <w:rFonts w:ascii="Times New Roman" w:hAnsi="Times New Roman" w:cs="Times New Roman"/>
-          <w:sz w:val="22"/>
-          <w:szCs w:val="22"/>
-        </w:rPr>
-        <w:t xml:space="preserve">With </w:t>
-      </w:r>
-      <w:r>
-        <w:rPr>
-          <w:rFonts w:ascii="Times New Roman" w:hAnsi="Times New Roman" w:cs="Times New Roman"/>
-          <w:sz w:val="22"/>
-          <w:szCs w:val="22"/>
-        </w:rPr>
-        <w:t>the mix given on the command line, perform allocation and deallocation requests</w:t>
-      </w:r>
-    </w:p>
-    <w:p>
-      <w:pPr>
-        <w:pStyle w:val="ListParagraph"/>
-        <w:numPr>
-          <w:ilvl w:val="1"/>
-          <w:numId w:val="2"/>
-        </w:numPr>
-        <w:rPr>
-          <w:rFonts w:ascii="Times New Roman" w:hAnsi="Times New Roman" w:cs="Times New Roman"/>
-          <w:sz w:val="22"/>
-          <w:szCs w:val="22"/>
-        </w:rPr>
-      </w:pPr>
-      <w:r>
-        <w:rPr>
-          <w:rFonts w:ascii="Times New Roman" w:hAnsi="Times New Roman" w:cs="Times New Roman"/>
-          <w:sz w:val="22"/>
-          <w:szCs w:val="22"/>
-        </w:rPr>
-        <w:lastRenderedPageBreak/>
-        <w:t>Each</w:t>
-      </w:r>
-      <w:r>
-        <w:rPr>
-          <w:rFonts w:ascii="Times New Roman" w:hAnsi="Times New Roman" w:cs="Times New Roman"/>
-          <w:sz w:val="22"/>
-          <w:szCs w:val="22"/>
-        </w:rPr>
-        <w:t xml:space="preserve"> allocation request will be for a unique PID; a given PID can only do one allocation request, whether it succeeds or not.</w:t>
-      </w:r>
-      <w:r>
-        <w:rPr>
-          <w:rFonts w:ascii="Times New Roman" w:hAnsi="Times New Roman" w:cs="Times New Roman"/>
-          <w:sz w:val="22"/>
-          <w:szCs w:val="22"/>
-        </w:rPr>
-        <w:t xml:space="preserve"> The request will be for [3-10] </w:t>
-      </w:r>
-      <w:r>
-        <w:rPr>
-          <w:rFonts w:ascii="Times New Roman" w:hAnsi="Times New Roman" w:cs="Times New Roman"/>
-          <w:sz w:val="22"/>
-          <w:szCs w:val="22"/>
-        </w:rPr>
-        <w:t xml:space="preserve">memory blocks. </w:t>
-      </w:r>
-      <w:r>
-        <w:rPr>
-          <w:rFonts w:ascii="Times New Roman" w:hAnsi="Times New Roman" w:cs="Times New Roman"/>
-          <w:sz w:val="22"/>
-          <w:szCs w:val="22"/>
-        </w:rPr>
-        <w:t>For each allocation request, whether successful or not, increment a counter of allocation attempts.</w:t>
-      </w:r>
-    </w:p>
-    <w:p>
-      <w:pPr>
-        <w:pStyle w:val="ListParagraph"/>
-        <w:ind w:left="1440"/>
-        <w:rPr>
-          <w:rFonts w:ascii="Times New Roman" w:hAnsi="Times New Roman" w:cs="Times New Roman"/>
-          <w:sz w:val="22"/>
-          <w:szCs w:val="22"/>
-        </w:rPr>
-      </w:pPr>
-      <w:r>
-        <w:rPr>
-          <w:rFonts w:ascii="Times New Roman" w:hAnsi="Times New Roman" w:cs="Times New Roman"/>
-          <w:sz w:val="22"/>
-          <w:szCs w:val="22"/>
-        </w:rPr>
-        <w:t>After a successful request</w:t>
-      </w:r>
-      <w:r>
-        <w:rPr>
-          <w:rFonts w:ascii="Times New Roman" w:hAnsi="Times New Roman" w:cs="Times New Roman"/>
-          <w:sz w:val="22"/>
-          <w:szCs w:val="22"/>
-        </w:rPr>
-        <w:t xml:space="preserve">, </w:t>
-      </w:r>
-      <w:r>
-        <w:rPr>
-          <w:rFonts w:ascii="Times New Roman" w:hAnsi="Times New Roman" w:cs="Times New Roman"/>
-          <w:sz w:val="22"/>
-          <w:szCs w:val="22"/>
-        </w:rPr>
-        <w:t>the main shal</w:t>
-      </w:r>
-      <w:r>
-        <w:rPr>
-          <w:rFonts w:ascii="Times New Roman" w:hAnsi="Times New Roman" w:cs="Times New Roman"/>
-          <w:sz w:val="22"/>
-          <w:szCs w:val="22"/>
-        </w:rPr>
-        <w:t>l:</w:t>
-      </w:r>
-    </w:p>
-    <w:p>
-      <w:pPr>
-        <w:pStyle w:val="ListParagraph"/>
-        <w:numPr>
-          <w:ilvl w:val="2"/>
-          <w:numId w:val="2"/>
-        </w:numPr>
-        <w:rPr>
-          <w:rFonts w:ascii="Times New Roman" w:hAnsi="Times New Roman" w:cs="Times New Roman"/>
-          <w:sz w:val="22"/>
-          <w:szCs w:val="22"/>
-        </w:rPr>
-      </w:pPr>
-      <w:r>
-        <w:rPr>
-          <w:rFonts w:ascii="Times New Roman" w:hAnsi="Times New Roman" w:cs="Times New Roman"/>
-          <w:sz w:val="22"/>
-          <w:szCs w:val="22"/>
-        </w:rPr>
-        <w:t>Add</w:t>
-      </w:r>
-      <w:r>
-        <w:rPr>
-          <w:rFonts w:ascii="Times New Roman" w:hAnsi="Times New Roman" w:cs="Times New Roman"/>
-          <w:sz w:val="22"/>
-          <w:szCs w:val="22"/>
-        </w:rPr>
-        <w:t xml:space="preserve"> the return value from allocM</w:t>
-      </w:r>
-      <w:r>
-        <w:rPr>
-          <w:rFonts w:ascii="Times New Roman" w:hAnsi="Times New Roman" w:cs="Times New Roman"/>
-          <w:sz w:val="22"/>
-          <w:szCs w:val="22"/>
-        </w:rPr>
-        <w:t>em() to an aggregate traversal counter.</w:t>
-      </w:r>
-    </w:p>
-    <w:p>
-      <w:pPr>
-        <w:pStyle w:val="ListParagraph"/>
-        <w:numPr>
-          <w:ilvl w:val="2"/>
-          <w:numId w:val="2"/>
-        </w:numPr>
-        <w:rPr>
-          <w:rFonts w:ascii="Times New Roman" w:hAnsi="Times New Roman" w:cs="Times New Roman"/>
-          <w:sz w:val="22"/>
-          <w:szCs w:val="22"/>
-        </w:rPr>
-      </w:pPr>
-      <w:r>
-        <w:rPr>
-          <w:rFonts w:ascii="Times New Roman" w:hAnsi="Times New Roman" w:cs="Times New Roman"/>
-          <w:sz w:val="22"/>
-          <w:szCs w:val="22"/>
-        </w:rPr>
-        <w:t>C</w:t>
-      </w:r>
-      <w:r>
-        <w:rPr>
-          <w:rFonts w:ascii="Times New Roman" w:hAnsi="Times New Roman" w:cs="Times New Roman"/>
-          <w:sz w:val="22"/>
-          <w:szCs w:val="22"/>
-        </w:rPr>
-        <w:t>all the memManager’s countHoles() function</w:t>
-      </w:r>
-      <w:r>
-        <w:rPr>
-          <w:rFonts w:ascii="Times New Roman" w:hAnsi="Times New Roman" w:cs="Times New Roman"/>
-          <w:sz w:val="22"/>
-          <w:szCs w:val="22"/>
-        </w:rPr>
-        <w:t xml:space="preserve">, </w:t>
-      </w:r>
-      <w:r>
-        <w:rPr>
-          <w:rFonts w:ascii="Times New Roman" w:hAnsi="Times New Roman" w:cs="Times New Roman"/>
-          <w:sz w:val="22"/>
-          <w:szCs w:val="22"/>
-        </w:rPr>
-        <w:t>adding</w:t>
-      </w:r>
-      <w:r>
-        <w:rPr>
-          <w:rFonts w:ascii="Times New Roman" w:hAnsi="Times New Roman" w:cs="Times New Roman"/>
-          <w:sz w:val="22"/>
-          <w:szCs w:val="22"/>
-        </w:rPr>
-        <w:t xml:space="preserve"> the response </w:t>
-      </w:r>
-      <w:r>
-        <w:rPr>
-          <w:rFonts w:ascii="Times New Roman" w:hAnsi="Times New Roman" w:cs="Times New Roman"/>
-          <w:sz w:val="22"/>
-          <w:szCs w:val="22"/>
-        </w:rPr>
-        <w:t>to an aggregate hole counter.</w:t>
-      </w:r>
-      <w:r>
-        <w:rPr>
-          <w:rFonts w:ascii="Times New Roman" w:hAnsi="Times New Roman" w:cs="Times New Roman"/>
-          <w:sz w:val="22"/>
-          <w:szCs w:val="22"/>
-        </w:rPr>
-        <w:t>.</w:t>
-      </w:r>
-    </w:p>
-    <w:p>
-      <w:pPr>
-        <w:pStyle w:val="ListParagraph"/>
-        <w:ind w:left="1440"/>
-        <w:rPr>
-          <w:rFonts w:ascii="Times New Roman" w:hAnsi="Times New Roman" w:cs="Times New Roman"/>
-          <w:sz w:val="22"/>
-          <w:szCs w:val="22"/>
-        </w:rPr>
-      </w:pPr>
-      <w:r>
-        <w:rPr>
-          <w:rFonts w:ascii="Times New Roman" w:hAnsi="Times New Roman" w:cs="Times New Roman"/>
-          <w:sz w:val="22"/>
-          <w:szCs w:val="22"/>
-        </w:rPr>
-        <w:t xml:space="preserve">After a </w:t>
-      </w:r>
-      <w:r>
-        <w:rPr>
-          <w:rFonts w:ascii="Times New Roman" w:hAnsi="Times New Roman" w:cs="Times New Roman"/>
-          <w:sz w:val="22"/>
-          <w:szCs w:val="22"/>
-        </w:rPr>
-        <w:t>failed memory allocation, the main shall increment an aggregate failure counter.</w:t>
-      </w:r>
-    </w:p>
-    <w:p>
-      <w:pPr>
-        <w:pStyle w:val="ListParagraph"/>
-        <w:numPr>
-          <w:ilvl w:val="1"/>
-          <w:numId w:val="2"/>
-        </w:numPr>
-        <w:rPr>
-          <w:rFonts w:ascii="Times New Roman" w:hAnsi="Times New Roman" w:cs="Times New Roman"/>
-          <w:sz w:val="22"/>
-          <w:szCs w:val="22"/>
-        </w:rPr>
-      </w:pPr>
-      <w:r>
-        <w:rPr>
-          <w:rFonts w:ascii="Times New Roman" w:hAnsi="Times New Roman" w:cs="Times New Roman"/>
-          <w:sz w:val="22"/>
-          <w:szCs w:val="22"/>
-        </w:rPr>
-        <w:t>Each deallocation request is for a PID that has allocated memory</w:t>
-      </w:r>
-      <w:r>
-        <w:rPr>
-          <w:rFonts w:ascii="Times New Roman" w:hAnsi="Times New Roman" w:cs="Times New Roman"/>
-          <w:sz w:val="22"/>
-          <w:szCs w:val="22"/>
-        </w:rPr>
-        <w:t>, with the PID chosen at random.</w:t>
-      </w:r>
+          <w:rFonts w:ascii="Courier New" w:hAnsi="Courier New" w:cs="Courier New"/>
+          <w:sz w:val="22"/>
+          <w:szCs w:val="22"/>
+        </w:rPr>
+      </w:pPr>
+      <w:r>
+        <w:rPr>
+          <w:rFonts w:ascii="Courier New" w:hAnsi="Courier New" w:cs="Courier New"/>
+          <w:sz w:val="22"/>
+          <w:szCs w:val="22"/>
+        </w:rPr>
+        <w:t xml:space="preserve">Your </w:t>
+      </w:r>
+      <w:proofErr w:type="spellStart"/>
+      <w:r>
+        <w:rPr>
+          <w:rFonts w:ascii="Courier New" w:hAnsi="Courier New" w:cs="Courier New"/>
+          <w:sz w:val="22"/>
+          <w:szCs w:val="22"/>
+        </w:rPr>
+        <w:t>Makefile</w:t>
+      </w:r>
+      <w:proofErr w:type="spellEnd"/>
     </w:p>
     <w:p>
       <w:pPr>
@@ -2140,172 +3578,6 @@
           <w:numId w:val="2"/>
         </w:numPr>
         <w:rPr>
-          <w:rFonts w:ascii="Times New Roman" w:hAnsi="Times New Roman" w:cs="Times New Roman"/>
-          <w:sz w:val="22"/>
-          <w:szCs w:val="22"/>
-        </w:rPr>
-      </w:pPr>
-      <w:r>
-        <w:rPr>
-          <w:rFonts w:ascii="Times New Roman" w:hAnsi="Times New Roman" w:cs="Times New Roman"/>
-          <w:sz w:val="22"/>
-          <w:szCs w:val="22"/>
-        </w:rPr>
-        <w:t>Prints the following statistics for each policy:</w:t>
-      </w:r>
-    </w:p>
-    <w:p>
-      <w:pPr>
-        <w:pStyle w:val="ListParagraph"/>
-        <w:numPr>
-          <w:ilvl w:val="1"/>
-          <w:numId w:val="2"/>
-        </w:numPr>
-        <w:rPr>
-          <w:rFonts w:ascii="Times New Roman" w:hAnsi="Times New Roman" w:cs="Times New Roman"/>
-          <w:sz w:val="22"/>
-          <w:szCs w:val="22"/>
-        </w:rPr>
-      </w:pPr>
-      <w:r>
-        <w:rPr>
-          <w:rFonts w:ascii="Times New Roman" w:hAnsi="Times New Roman" w:cs="Times New Roman"/>
-          <w:sz w:val="22"/>
-          <w:szCs w:val="22"/>
-        </w:rPr>
-        <w:t>Print the average of the hole counts, which will be the aggregate hole counter divided by the number of successful allocations.</w:t>
-      </w:r>
-    </w:p>
-    <w:p>
-      <w:pPr>
-        <w:pStyle w:val="ListParagraph"/>
-        <w:numPr>
-          <w:ilvl w:val="1"/>
-          <w:numId w:val="2"/>
-        </w:numPr>
-        <w:rPr>
-          <w:rFonts w:ascii="Times New Roman" w:hAnsi="Times New Roman" w:cs="Times New Roman"/>
-          <w:sz w:val="22"/>
-          <w:szCs w:val="22"/>
-        </w:rPr>
-      </w:pPr>
-      <w:r>
-        <w:rPr>
-          <w:rFonts w:ascii="Times New Roman" w:hAnsi="Times New Roman" w:cs="Times New Roman"/>
-          <w:sz w:val="22"/>
-          <w:szCs w:val="22"/>
-        </w:rPr>
-        <w:t xml:space="preserve">Print the </w:t>
-      </w:r>
-      <w:r>
-        <w:rPr>
-          <w:rFonts w:ascii="Times New Roman" w:hAnsi="Times New Roman" w:cs="Times New Roman"/>
-          <w:sz w:val="22"/>
-          <w:szCs w:val="22"/>
-        </w:rPr>
-        <w:t>average number of traversals, which will be the aggregate traversal counter divided by the number of successful allocations.</w:t>
-      </w:r>
-    </w:p>
-    <w:p>
-      <w:pPr>
-        <w:pStyle w:val="ListParagraph"/>
-        <w:numPr>
-          <w:ilvl w:val="1"/>
-          <w:numId w:val="2"/>
-        </w:numPr>
-        <w:rPr>
-          <w:rFonts w:ascii="Times New Roman" w:hAnsi="Times New Roman" w:cs="Times New Roman"/>
-          <w:sz w:val="22"/>
-          <w:szCs w:val="22"/>
-        </w:rPr>
-      </w:pPr>
-      <w:r>
-        <w:rPr>
-          <w:rFonts w:ascii="Times New Roman" w:hAnsi="Times New Roman" w:cs="Times New Roman"/>
-          <w:sz w:val="22"/>
-          <w:szCs w:val="22"/>
-        </w:rPr>
-        <w:t xml:space="preserve">Print the percentage of </w:t>
-      </w:r>
-      <w:r>
-        <w:rPr>
-          <w:rFonts w:ascii="Times New Roman" w:hAnsi="Times New Roman" w:cs="Times New Roman"/>
-          <w:sz w:val="22"/>
-          <w:szCs w:val="22"/>
-        </w:rPr>
-        <w:t xml:space="preserve">denials, which will be the aggregate </w:t>
-      </w:r>
-      <w:r>
-        <w:rPr>
-          <w:rFonts w:ascii="Times New Roman" w:hAnsi="Times New Roman" w:cs="Times New Roman"/>
-          <w:sz w:val="22"/>
-          <w:szCs w:val="22"/>
-        </w:rPr>
-        <w:t>failed allocation attempts divided by the total number of allocation attempts.</w:t>
-      </w:r>
-    </w:p>
-    <w:p>
-      <w:pPr>
-        <w:rPr>
-          <w:rFonts w:ascii="Times New Roman" w:hAnsi="Times New Roman" w:cs="Times New Roman"/>
-          <w:sz w:val="22"/>
-          <w:szCs w:val="22"/>
-        </w:rPr>
-      </w:pPr>
-      <w:r>
-        <w:rPr>
-          <w:rFonts w:ascii="Times New Roman" w:hAnsi="Times New Roman" w:cs="Times New Roman"/>
-          <w:sz w:val="22"/>
-          <w:szCs w:val="22"/>
-        </w:rPr>
-        <w:t>There are three performance parameters that your simulation should calculate for all four techniques: average number of external fragments, average allocation time in terms of the average number of nodes traversed in allocation, and the percentage of times an allocation request is denied.</w:t>
-      </w:r>
-    </w:p>
-    <w:p>
-      <w:pPr>
-        <w:rPr>
-          <w:rFonts w:ascii="Times New Roman" w:hAnsi="Times New Roman" w:cs="Times New Roman"/>
-          <w:sz w:val="22"/>
-          <w:szCs w:val="22"/>
-        </w:rPr>
-      </w:pPr>
-      <w:r>
-        <w:rPr>
-          <w:rFonts w:ascii="Times New Roman" w:hAnsi="Times New Roman" w:cs="Times New Roman"/>
-          <w:sz w:val="22"/>
-          <w:szCs w:val="22"/>
-        </w:rPr>
-        <w:t>The program shall consist of the following files: Makefile, memSim.h memSim.cpp, mimSimMain.cpp.</w:t>
-      </w:r>
-    </w:p>
-    <w:p>
-      <w:pPr>
-        <w:rPr>
-          <w:rFonts w:ascii="Times New Roman" w:hAnsi="Times New Roman" w:cs="Times New Roman"/>
-          <w:sz w:val="22"/>
-          <w:szCs w:val="22"/>
-        </w:rPr>
-      </w:pPr>
-      <w:r>
-        <w:rPr>
-          <w:rFonts w:ascii="Times New Roman" w:hAnsi="Times New Roman" w:cs="Times New Roman"/>
-          <w:sz w:val="22"/>
-          <w:szCs w:val="22"/>
-        </w:rPr>
-        <w:t xml:space="preserve">For the final submission, the program shall be run with the following sets of parameters, with the output being captured in </w:t>
-      </w:r>
-      <w:r>
-        <w:rPr>
-          <w:rFonts w:ascii="Times New Roman" w:hAnsi="Times New Roman" w:cs="Times New Roman"/>
-          <w:sz w:val="22"/>
-          <w:szCs w:val="22"/>
-        </w:rPr>
-        <w:t>output.txt:</w:t>
-      </w:r>
-    </w:p>
-    <w:p>
-      <w:pPr>
-        <w:rPr>
           <w:rFonts w:ascii="Courier New" w:hAnsi="Courier New" w:cs="Courier New"/>
           <w:sz w:val="22"/>
           <w:szCs w:val="22"/>
@@ -2317,139 +3589,7 @@
           <w:sz w:val="22"/>
           <w:szCs w:val="22"/>
         </w:rPr>
-        <w:t>./</w:t>
-      </w:r>
-      <w:r>
-        <w:rPr>
-          <w:rFonts w:ascii="Courier New" w:hAnsi="Courier New" w:cs="Courier New"/>
-          <w:sz w:val="22"/>
-          <w:szCs w:val="22"/>
-        </w:rPr>
-        <w:t>memSim</w:t>
-      </w:r>
-      <w:r>
-        <w:rPr>
-          <w:rFonts w:ascii="Courier New" w:hAnsi="Courier New" w:cs="Courier New"/>
-          <w:sz w:val="22"/>
-          <w:szCs w:val="22"/>
-        </w:rPr>
-        <w:t xml:space="preserve"> </w:t>
-      </w:r>
-      <w:r>
-        <w:rPr>
-          <w:rFonts w:ascii="Courier New" w:hAnsi="Courier New" w:cs="Courier New"/>
-          <w:sz w:val="22"/>
-          <w:szCs w:val="22"/>
-        </w:rPr>
-        <w:t xml:space="preserve">10000 50 1 &gt; </w:t>
-      </w:r>
-      <w:r>
-        <w:rPr>
-          <w:rFonts w:ascii="Courier New" w:hAnsi="Courier New" w:cs="Courier New"/>
-          <w:sz w:val="22"/>
-          <w:szCs w:val="22"/>
-        </w:rPr>
-        <w:t>output.txt</w:t>
-      </w:r>
-    </w:p>
-    <w:p>
-      <w:pPr>
-        <w:rPr>
-          <w:rFonts w:ascii="Courier New" w:hAnsi="Courier New" w:cs="Courier New"/>
-          <w:sz w:val="22"/>
-          <w:szCs w:val="22"/>
-        </w:rPr>
-      </w:pPr>
-      <w:r>
-        <w:rPr>
-          <w:rFonts w:ascii="Courier New" w:hAnsi="Courier New" w:cs="Courier New"/>
-          <w:sz w:val="22"/>
-          <w:szCs w:val="22"/>
-        </w:rPr>
-        <w:t xml:space="preserve">./memSim 10000 70 </w:t>
-      </w:r>
-      <w:r>
-        <w:rPr>
-          <w:rFonts w:ascii="Courier New" w:hAnsi="Courier New" w:cs="Courier New"/>
-          <w:sz w:val="22"/>
-          <w:szCs w:val="22"/>
-        </w:rPr>
-        <w:t>1 &gt;&gt; output.txt</w:t>
-      </w:r>
-    </w:p>
-    <w:p>
-      <w:pPr>
-        <w:rPr>
-          <w:rFonts w:ascii="Courier New" w:hAnsi="Courier New" w:cs="Courier New"/>
-          <w:sz w:val="22"/>
-          <w:szCs w:val="22"/>
-        </w:rPr>
-      </w:pPr>
-      <w:r>
-        <w:rPr>
-          <w:rFonts w:ascii="Courier New" w:hAnsi="Courier New" w:cs="Courier New"/>
-          <w:sz w:val="22"/>
-          <w:szCs w:val="22"/>
-        </w:rPr>
-        <w:t>./memSim 10000 85 1 &gt;&gt; output.txt</w:t>
-      </w:r>
-    </w:p>
-    <w:p>
-      <w:pPr>
-        <w:rPr>
-          <w:rFonts w:ascii="Courier New" w:hAnsi="Courier New" w:cs="Courier New"/>
-          <w:sz w:val="22"/>
-          <w:szCs w:val="22"/>
-        </w:rPr>
-      </w:pPr>
-    </w:p>
-    <w:p>
-      <w:pPr>
-        <w:rPr>
-          <w:rFonts w:ascii="Courier New" w:hAnsi="Courier New" w:cs="Courier New"/>
-          <w:sz w:val="22"/>
-          <w:szCs w:val="22"/>
-        </w:rPr>
-      </w:pPr>
-      <w:r>
-        <w:rPr>
-          <w:rFonts w:ascii="Courier New" w:hAnsi="Courier New" w:cs="Courier New"/>
-          <w:sz w:val="22"/>
-          <w:szCs w:val="22"/>
-        </w:rPr>
-        <w:t xml:space="preserve">Your </w:t>
-      </w:r>
-      <w:r>
-        <w:rPr>
-          <w:rFonts w:ascii="Courier New" w:hAnsi="Courier New" w:cs="Courier New"/>
-          <w:sz w:val="22"/>
-          <w:szCs w:val="22"/>
-        </w:rPr>
-        <w:t xml:space="preserve">D2L </w:t>
-      </w:r>
-      <w:r>
-        <w:rPr>
-          <w:rFonts w:ascii="Courier New" w:hAnsi="Courier New" w:cs="Courier New"/>
-          <w:sz w:val="22"/>
-          <w:szCs w:val="22"/>
-        </w:rPr>
-        <w:t xml:space="preserve">submission shall include </w:t>
-      </w:r>
-      <w:r>
-        <w:rPr>
-          <w:rFonts w:ascii="Courier New" w:hAnsi="Courier New" w:cs="Courier New"/>
-          <w:sz w:val="22"/>
-          <w:szCs w:val="22"/>
-        </w:rPr>
-        <w:t xml:space="preserve">a zip file containing </w:t>
-      </w:r>
-      <w:r>
-        <w:rPr>
-          <w:rFonts w:ascii="Courier New" w:hAnsi="Courier New" w:cs="Courier New"/>
-          <w:sz w:val="22"/>
-          <w:szCs w:val="22"/>
-        </w:rPr>
-        <w:t>the following:</w:t>
+        <w:t>Your output.txt file</w:t>
       </w:r>
     </w:p>
     <w:p>
@@ -2471,106 +3611,95 @@
           <w:sz w:val="22"/>
           <w:szCs w:val="22"/>
         </w:rPr>
-        <w:t>Your source files</w:t>
-      </w:r>
-    </w:p>
-    <w:p>
-      <w:pPr>
-        <w:pStyle w:val="ListParagraph"/>
-        <w:numPr>
-          <w:ilvl w:val="0"/>
-          <w:numId w:val="2"/>
-        </w:numPr>
+        <w:t>A Word document assessing the final outputs and your thoughts about the differences</w:t>
+      </w:r>
+      <w:r>
         <w:rPr>
           <w:rFonts w:ascii="Courier New" w:hAnsi="Courier New" w:cs="Courier New"/>
           <w:sz w:val="22"/>
           <w:szCs w:val="22"/>
         </w:rPr>
-      </w:pPr>
+        <w:t xml:space="preserve"> observed between the different mixes of </w:t>
+      </w:r>
+      <w:proofErr w:type="spellStart"/>
       <w:r>
         <w:rPr>
           <w:rFonts w:ascii="Courier New" w:hAnsi="Courier New" w:cs="Courier New"/>
           <w:sz w:val="22"/>
           <w:szCs w:val="22"/>
         </w:rPr>
-        <w:t>Your Makefile</w:t>
-      </w:r>
-    </w:p>
-    <w:p>
-      <w:pPr>
-        <w:pStyle w:val="ListParagraph"/>
-        <w:numPr>
-          <w:ilvl w:val="0"/>
-          <w:numId w:val="2"/>
-        </w:numPr>
+        <w:t>alloc</w:t>
+      </w:r>
+      <w:proofErr w:type="spellEnd"/>
+      <w:r>
         <w:rPr>
           <w:rFonts w:ascii="Courier New" w:hAnsi="Courier New" w:cs="Courier New"/>
           <w:sz w:val="22"/>
           <w:szCs w:val="22"/>
         </w:rPr>
-      </w:pPr>
+        <w:t>/</w:t>
+      </w:r>
+      <w:proofErr w:type="spellStart"/>
       <w:r>
         <w:rPr>
           <w:rFonts w:ascii="Courier New" w:hAnsi="Courier New" w:cs="Courier New"/>
           <w:sz w:val="22"/>
           <w:szCs w:val="22"/>
         </w:rPr>
-        <w:t>Your output.txt file</w:t>
-      </w:r>
-    </w:p>
-    <w:p>
-      <w:pPr>
-        <w:pStyle w:val="ListParagraph"/>
-        <w:numPr>
-          <w:ilvl w:val="0"/>
-          <w:numId w:val="2"/>
-        </w:numPr>
+        <w:t>dealloc</w:t>
+      </w:r>
+      <w:proofErr w:type="spellEnd"/>
+      <w:r>
         <w:rPr>
           <w:rFonts w:ascii="Courier New" w:hAnsi="Courier New" w:cs="Courier New"/>
           <w:sz w:val="22"/>
           <w:szCs w:val="22"/>
         </w:rPr>
-      </w:pPr>
-      <w:r>
+        <w:t xml:space="preserve"> and the different policies.</w:t>
+      </w:r>
+    </w:p>
+    <w:p>
+      <w:pPr>
         <w:rPr>
           <w:rFonts w:ascii="Courier New" w:hAnsi="Courier New" w:cs="Courier New"/>
           <w:sz w:val="22"/>
           <w:szCs w:val="22"/>
         </w:rPr>
-        <w:t>A Word document assessing the final outputs and your thoughts about the differences</w:t>
-      </w:r>
+      </w:pPr>
       <w:r>
         <w:rPr>
           <w:rFonts w:ascii="Courier New" w:hAnsi="Courier New" w:cs="Courier New"/>
           <w:sz w:val="22"/>
           <w:szCs w:val="22"/>
         </w:rPr>
-        <w:t xml:space="preserve"> observed between the different mixes of alloc/dealloc and the different policies.</w:t>
-      </w:r>
-    </w:p>
-    <w:p>
-      <w:pPr>
+        <w:lastRenderedPageBreak/>
+        <w:t xml:space="preserve">Your printed submission shall include </w:t>
+      </w:r>
+      <w:r>
         <w:rPr>
           <w:rFonts w:ascii="Courier New" w:hAnsi="Courier New" w:cs="Courier New"/>
           <w:sz w:val="22"/>
           <w:szCs w:val="22"/>
         </w:rPr>
-      </w:pPr>
+        <w:t xml:space="preserve">all the above, except for the </w:t>
+      </w:r>
+      <w:proofErr w:type="spellStart"/>
       <w:r>
         <w:rPr>
           <w:rFonts w:ascii="Courier New" w:hAnsi="Courier New" w:cs="Courier New"/>
           <w:sz w:val="22"/>
           <w:szCs w:val="22"/>
         </w:rPr>
-        <w:t xml:space="preserve">Your printed submission shall include </w:t>
-      </w:r>
+        <w:t>Makefile</w:t>
+      </w:r>
+      <w:proofErr w:type="spellEnd"/>
       <w:r>
         <w:rPr>
           <w:rFonts w:ascii="Courier New" w:hAnsi="Courier New" w:cs="Courier New"/>
           <w:sz w:val="22"/>
           <w:szCs w:val="22"/>
         </w:rPr>
-        <w:t>all the above, except for the Makefile and the output.txt file.</w:t>
+        <w:t xml:space="preserve"> and the output.txt file.</w:t>
       </w:r>
     </w:p>
     <w:sectPr>

</xml_diff>